<commit_message>
update(global): add asstslinks template; update .doc, update ClientManager; add client lib
</commit_message>
<xml_diff>
--- a/mrc_tech_design.docx
+++ b/mrc_tech_design.docx
@@ -436,6 +436,7 @@
           <w:bCs/>
           <w:lang w:val="uk-UA"/>
         </w:rPr>
+        <w:lastRenderedPageBreak/>
         <w:t>App.tsx - Application Bootstrap &amp; Global State</w:t>
       </w:r>
     </w:p>
@@ -614,7 +615,6 @@
         <w:rPr>
           <w:lang w:val="uk-UA"/>
         </w:rPr>
-        <w:lastRenderedPageBreak/>
         <w:t>Manages the WebSocket connection lifecycle.</w:t>
       </w:r>
     </w:p>
@@ -932,6 +932,7 @@
           <w:bCs/>
           <w:lang w:val="uk-UA"/>
         </w:rPr>
+        <w:lastRenderedPageBreak/>
         <w:t>InputGuard.tsx - Interaction Control Overlay</w:t>
       </w:r>
     </w:p>
@@ -1198,7 +1199,6 @@
           <w:bCs/>
           <w:lang w:val="uk-UA"/>
         </w:rPr>
-        <w:lastRenderedPageBreak/>
         <w:t>Responsibilities</w:t>
       </w:r>
       <w:r>
@@ -1335,7 +1335,10 @@
           <w:lang w:val="uk-UA"/>
         </w:rPr>
         <w:lastRenderedPageBreak/>
-        <w:t>3. User Onboarding &amp; Connection Flows</w:t>
+        <w:t xml:space="preserve">3. </w:t>
+      </w:r>
+      <w:r>
+        <w:t>User Flows &amp; Deep Linking Methods</w:t>
       </w:r>
     </w:p>
     <w:p>
@@ -1382,9 +1385,9 @@
           <w:noProof/>
         </w:rPr>
         <w:drawing>
-          <wp:inline distT="0" distB="0" distL="0" distR="0" wp14:anchorId="2F6EA989" wp14:editId="436AB048">
-            <wp:extent cx="6850380" cy="7209790"/>
-            <wp:effectExtent l="0" t="0" r="7620" b="0"/>
+          <wp:inline distT="0" distB="0" distL="0" distR="0" wp14:anchorId="2F6EA989" wp14:editId="0B97A970">
+            <wp:extent cx="6172220" cy="6496050"/>
+            <wp:effectExtent l="0" t="0" r="0" b="0"/>
             <wp:docPr id="1280596360" name="Picture 2"/>
             <wp:cNvGraphicFramePr>
               <a:graphicFrameLocks xmlns:a="http://schemas.openxmlformats.org/drawingml/2006/main" noChangeAspect="1"/>
@@ -1414,7 +1417,7 @@
                   <pic:spPr bwMode="auto">
                     <a:xfrm>
                       <a:off x="0" y="0"/>
-                      <a:ext cx="6850380" cy="7209790"/>
+                      <a:ext cx="6175767" cy="6499783"/>
                     </a:xfrm>
                     <a:prstGeom prst="rect">
                       <a:avLst/>
@@ -1432,11 +1435,6 @@
       </w:r>
     </w:p>
     <w:p>
-      <w:r>
-        <w:br w:type="page"/>
-      </w:r>
-    </w:p>
-    <w:p>
       <w:pPr>
         <w:pStyle w:val="Heading2"/>
       </w:pPr>
@@ -1448,29 +1446,32 @@
         <w:t>3.2 Detailed Flow Cases</w:t>
       </w:r>
     </w:p>
+    <w:p>
+      <w:pPr>
+        <w:pStyle w:val="Heading3"/>
+      </w:pPr>
+      <w:r>
+        <w:t>Case 1. Application Installed </w:t>
+      </w:r>
+    </w:p>
     <w:p/>
     <w:p>
       <w:pPr>
-        <w:pStyle w:val="Heading3"/>
-      </w:pPr>
-      <w:r>
-        <w:t>Case 1. Application Installed </w:t>
-      </w:r>
-    </w:p>
-    <w:p/>
-    <w:p>
-      <w:pPr>
         <w:jc w:val="center"/>
         <w:rPr>
           <w:lang w:val="uk-UA"/>
         </w:rPr>
       </w:pPr>
       <w:r>
+        <w:rPr>
+          <w:noProof/>
+          <w:lang w:val="uk-UA"/>
+        </w:rPr>
         <w:drawing>
-          <wp:inline distT="0" distB="0" distL="0" distR="0" wp14:anchorId="5FFF9BDF" wp14:editId="67965B14">
-            <wp:extent cx="3990721" cy="7054850"/>
-            <wp:effectExtent l="0" t="0" r="0" b="0"/>
-            <wp:docPr id="547410816" name="Picture 14"/>
+          <wp:inline distT="0" distB="0" distL="0" distR="0" wp14:anchorId="696C8682" wp14:editId="448A73E5">
+            <wp:extent cx="4114800" cy="7269667"/>
+            <wp:effectExtent l="0" t="0" r="0" b="7620"/>
+            <wp:docPr id="101034752" name="Picture 2"/>
             <wp:cNvGraphicFramePr>
               <a:graphicFrameLocks xmlns:a="http://schemas.openxmlformats.org/drawingml/2006/main" noChangeAspect="1"/>
             </wp:cNvGraphicFramePr>
@@ -1478,7 +1479,7 @@
               <a:graphicData uri="http://schemas.openxmlformats.org/drawingml/2006/picture">
                 <pic:pic xmlns:pic="http://schemas.openxmlformats.org/drawingml/2006/picture">
                   <pic:nvPicPr>
-                    <pic:cNvPr id="0" name="Picture 56"/>
+                    <pic:cNvPr id="0" name="Picture 2"/>
                     <pic:cNvPicPr>
                       <a:picLocks noChangeAspect="1" noChangeArrowheads="1"/>
                     </pic:cNvPicPr>
@@ -1499,7 +1500,7 @@
                   <pic:spPr bwMode="auto">
                     <a:xfrm>
                       <a:off x="0" y="0"/>
-                      <a:ext cx="3999844" cy="7070978"/>
+                      <a:ext cx="4121120" cy="7280833"/>
                     </a:xfrm>
                     <a:prstGeom prst="rect">
                       <a:avLst/>
@@ -1515,13 +1516,6 @@
           </wp:inline>
         </w:drawing>
       </w:r>
-    </w:p>
-    <w:p>
-      <w:pPr>
-        <w:rPr>
-          <w:noProof/>
-        </w:rPr>
-      </w:pPr>
       <w:r>
         <w:rPr>
           <w:noProof/>
@@ -1548,10 +1542,10 @@
           <w:noProof/>
         </w:rPr>
         <w:drawing>
-          <wp:inline distT="0" distB="0" distL="0" distR="0" wp14:anchorId="524628CC" wp14:editId="1E089EDC">
-            <wp:extent cx="4565650" cy="6574536"/>
-            <wp:effectExtent l="0" t="0" r="6350" b="0"/>
-            <wp:docPr id="1506767860" name="Picture 15"/>
+          <wp:inline distT="0" distB="0" distL="0" distR="0" wp14:anchorId="0DA7E6E6" wp14:editId="11C4E267">
+            <wp:extent cx="5175250" cy="6983270"/>
+            <wp:effectExtent l="0" t="0" r="6350" b="8255"/>
+            <wp:docPr id="2005376459" name="Picture 3"/>
             <wp:cNvGraphicFramePr>
               <a:graphicFrameLocks xmlns:a="http://schemas.openxmlformats.org/drawingml/2006/main" noChangeAspect="1"/>
             </wp:cNvGraphicFramePr>
@@ -1559,7 +1553,7 @@
               <a:graphicData uri="http://schemas.openxmlformats.org/drawingml/2006/picture">
                 <pic:pic xmlns:pic="http://schemas.openxmlformats.org/drawingml/2006/picture">
                   <pic:nvPicPr>
-                    <pic:cNvPr id="0" name="Picture 57"/>
+                    <pic:cNvPr id="0" name="Picture 3"/>
                     <pic:cNvPicPr>
                       <a:picLocks noChangeAspect="1" noChangeArrowheads="1"/>
                     </pic:cNvPicPr>
@@ -1580,7 +1574,7 @@
                   <pic:spPr bwMode="auto">
                     <a:xfrm>
                       <a:off x="0" y="0"/>
-                      <a:ext cx="4572876" cy="6584942"/>
+                      <a:ext cx="5179022" cy="6988360"/>
                     </a:xfrm>
                     <a:prstGeom prst="rect">
                       <a:avLst/>
@@ -1602,13 +1596,6 @@
         <w:pStyle w:val="Heading3"/>
       </w:pPr>
     </w:p>
-    <w:p>
-      <w:pPr>
-        <w:pStyle w:val="Heading3"/>
-      </w:pPr>
-    </w:p>
-    <w:p/>
-    <w:p/>
     <w:p/>
     <w:p>
       <w:pPr>
@@ -1622,7 +1609,6 @@
         <w:t>Case 3. Application Launches First from the Mobile Device</w:t>
       </w:r>
     </w:p>
-    <w:p/>
     <w:p>
       <w:pPr>
         <w:jc w:val="center"/>
@@ -1632,10 +1618,10 @@
           <w:noProof/>
         </w:rPr>
         <w:drawing>
-          <wp:inline distT="0" distB="0" distL="0" distR="0" wp14:anchorId="7484D072" wp14:editId="5B9BF8E6">
-            <wp:extent cx="3854450" cy="7150951"/>
-            <wp:effectExtent l="0" t="0" r="0" b="0"/>
-            <wp:docPr id="1933524693" name="Picture 16"/>
+          <wp:inline distT="0" distB="0" distL="0" distR="0" wp14:anchorId="56DFD8FF" wp14:editId="55B5124C">
+            <wp:extent cx="3708400" cy="6875660"/>
+            <wp:effectExtent l="0" t="0" r="6350" b="1905"/>
+            <wp:docPr id="450886616" name="Picture 4"/>
             <wp:cNvGraphicFramePr>
               <a:graphicFrameLocks xmlns:a="http://schemas.openxmlformats.org/drawingml/2006/main" noChangeAspect="1"/>
             </wp:cNvGraphicFramePr>
@@ -1643,7 +1629,7 @@
               <a:graphicData uri="http://schemas.openxmlformats.org/drawingml/2006/picture">
                 <pic:pic xmlns:pic="http://schemas.openxmlformats.org/drawingml/2006/picture">
                   <pic:nvPicPr>
-                    <pic:cNvPr id="0" name="Picture 58"/>
+                    <pic:cNvPr id="0" name="Picture 4"/>
                     <pic:cNvPicPr>
                       <a:picLocks noChangeAspect="1" noChangeArrowheads="1"/>
                     </pic:cNvPicPr>
@@ -1664,7 +1650,7 @@
                   <pic:spPr bwMode="auto">
                     <a:xfrm>
                       <a:off x="0" y="0"/>
-                      <a:ext cx="3865751" cy="7171917"/>
+                      <a:ext cx="3710591" cy="6879722"/>
                     </a:xfrm>
                     <a:prstGeom prst="rect">
                       <a:avLst/>
@@ -1683,1108 +1669,117 @@
     </w:p>
     <w:p>
       <w:pPr>
+        <w:jc w:val="center"/>
+      </w:pPr>
+    </w:p>
+    <w:p/>
+    <w:p>
+      <w:pPr>
+        <w:rPr>
+          <w:sz w:val="24"/>
+          <w:szCs w:val="24"/>
+        </w:rPr>
+      </w:pPr>
+    </w:p>
+    <w:p>
+      <w:pPr>
+        <w:pStyle w:val="Heading2"/>
+        <w:rPr>
+          <w:lang w:val="uk-UA"/>
+        </w:rPr>
+      </w:pPr>
+      <w:r>
+        <w:rPr>
+          <w:lang w:val="uk-UA"/>
+        </w:rPr>
+        <w:lastRenderedPageBreak/>
+        <w:t>3.3 Universal Links (iOS) &amp; App Links (Android)</w:t>
+      </w:r>
+    </w:p>
+    <w:p>
+      <w:pPr>
+        <w:rPr>
+          <w:sz w:val="24"/>
+          <w:szCs w:val="24"/>
+          <w:lang w:val="uk-UA"/>
+        </w:rPr>
+      </w:pPr>
+      <w:r>
+        <w:rPr>
+          <w:sz w:val="24"/>
+          <w:szCs w:val="24"/>
+          <w:lang w:val="uk-UA"/>
+        </w:rPr>
+        <w:t xml:space="preserve">This technical specification defines the implementation of Universal Links (iOS) and App Links (Android). </w:t>
+      </w:r>
+      <w:r>
+        <w:rPr>
+          <w:sz w:val="24"/>
+          <w:szCs w:val="24"/>
+        </w:rPr>
+        <w:t>T</w:t>
+      </w:r>
+      <w:r>
+        <w:rPr>
+          <w:sz w:val="24"/>
+          <w:szCs w:val="24"/>
+          <w:lang w:val="uk-UA"/>
+        </w:rPr>
+        <w:t>hese</w:t>
+      </w:r>
+      <w:r>
+        <w:rPr>
+          <w:sz w:val="24"/>
+          <w:szCs w:val="24"/>
+        </w:rPr>
+        <w:t xml:space="preserve"> </w:t>
+      </w:r>
+      <w:r>
+        <w:rPr>
+          <w:sz w:val="24"/>
+          <w:szCs w:val="24"/>
+          <w:lang w:val="uk-UA"/>
+        </w:rPr>
+        <w:t>are OS-level standards that use verified domain ownership to route users directly to the native application without leaving the current context.</w:t>
+      </w:r>
+    </w:p>
+    <w:p>
+      <w:pPr>
+        <w:rPr>
+          <w:sz w:val="24"/>
+          <w:szCs w:val="24"/>
+          <w:lang w:val="uk-UA"/>
+        </w:rPr>
+      </w:pPr>
+      <w:r>
         <w:rPr>
           <w:b/>
           <w:bCs/>
-          <w:lang w:val="uk-UA"/>
-        </w:rPr>
-      </w:pPr>
-    </w:p>
-    <w:p>
-      <w:pPr>
-        <w:pStyle w:val="Heading2"/>
-      </w:pPr>
-    </w:p>
-    <w:p>
-      <w:pPr>
-        <w:pStyle w:val="Heading2"/>
-      </w:pPr>
-    </w:p>
-    <w:p>
-      <w:pPr>
-        <w:pStyle w:val="Heading2"/>
-        <w:rPr>
-          <w:lang w:val="uk-UA"/>
-        </w:rPr>
-      </w:pPr>
-      <w:r>
-        <w:rPr>
-          <w:lang w:val="uk-UA"/>
-        </w:rPr>
-        <w:t>3.3 Methods of Deferred Deep Linking</w:t>
-      </w:r>
-    </w:p>
-    <w:p>
-      <w:pPr>
-        <w:rPr>
-          <w:lang w:val="uk-UA"/>
-        </w:rPr>
-      </w:pPr>
-    </w:p>
-    <w:p>
-      <w:pPr>
-        <w:pStyle w:val="Heading3"/>
-        <w:rPr>
-          <w:lang w:val="uk-UA"/>
-        </w:rPr>
-      </w:pPr>
-      <w:r>
-        <w:rPr>
-          <w:lang w:val="uk-UA"/>
-        </w:rPr>
-        <w:t xml:space="preserve">Method </w:t>
-      </w:r>
-      <w:r>
-        <w:rPr>
-          <w:lang w:val="uk-UA"/>
-        </w:rPr>
-        <w:t>1</w:t>
-      </w:r>
-      <w:r>
-        <w:rPr>
-          <w:lang w:val="uk-UA"/>
-        </w:rPr>
-        <w:t xml:space="preserve">: </w:t>
-      </w:r>
-      <w:r>
-        <w:t>MMP</w:t>
-      </w:r>
-      <w:r>
-        <w:rPr>
-          <w:lang w:val="uk-UA"/>
-        </w:rPr>
-        <w:t xml:space="preserve"> (</w:t>
-      </w:r>
-      <w:r>
-        <w:t>Mobile Measurement Partner</w:t>
-      </w:r>
-      <w:r>
-        <w:rPr>
-          <w:lang w:val="uk-UA"/>
-        </w:rPr>
-        <w:t>)</w:t>
-      </w:r>
-    </w:p>
-    <w:p>
-      <w:pPr>
-        <w:rPr>
-          <w:sz w:val="24"/>
-          <w:szCs w:val="24"/>
-          <w:lang w:val="uk-UA"/>
-        </w:rPr>
-      </w:pPr>
-      <w:r>
-        <w:rPr>
-          <w:sz w:val="24"/>
-          <w:szCs w:val="24"/>
-          <w:lang w:val="uk-UA"/>
-        </w:rPr>
-        <w:t>A Mobile Measurement Partner is a third-party platform that acts as a bridge between the "click" (or QR scan) and the application. Modern MMP links (e.g., https://mygame.app.link/join?roomID=XYZ) are designed to handle both installed and uninstalled states seamlessly.</w:t>
-      </w:r>
-    </w:p>
-    <w:p>
-      <w:pPr>
-        <w:rPr>
-          <w:sz w:val="24"/>
-          <w:szCs w:val="24"/>
-          <w:lang w:val="uk-UA"/>
-        </w:rPr>
-      </w:pPr>
+          <w:sz w:val="24"/>
+          <w:szCs w:val="24"/>
+          <w:lang w:val="uk-UA"/>
+        </w:rPr>
+        <w:t>1. Overview</w:t>
+      </w:r>
+      <w:r>
+        <w:rPr>
+          <w:sz w:val="24"/>
+          <w:szCs w:val="24"/>
+          <w:lang w:val="uk-UA"/>
+        </w:rPr>
+        <w:t> Universal Links (iOS) and App Links (Android) allow a standard HTTPS URL (e.g., https://yourgame.com/join?</w:t>
+      </w:r>
+      <w:proofErr w:type="spellStart"/>
       <w:r>
         <w:rPr>
           <w:b/>
           <w:bCs/>
           <w:sz w:val="24"/>
           <w:szCs w:val="24"/>
-          <w:lang w:val="uk-UA"/>
-        </w:rPr>
-        <w:t>Path A: The Direct Launch Process (If Application IS Installed)</w:t>
-      </w:r>
-      <w:r>
-        <w:rPr>
-          <w:sz w:val="24"/>
-          <w:szCs w:val="24"/>
-          <w:lang w:val="uk-UA"/>
-        </w:rPr>
-        <w:t> When the user scans the QR code and the application is already on their device, the MMP link acts as a standard direct deep link:</w:t>
-      </w:r>
-    </w:p>
-    <w:p>
-      <w:pPr>
-        <w:numPr>
-          <w:ilvl w:val="0"/>
-          <w:numId w:val="39"/>
-        </w:numPr>
-        <w:rPr>
-          <w:sz w:val="24"/>
-          <w:szCs w:val="24"/>
-          <w:lang w:val="uk-UA"/>
-        </w:rPr>
-      </w:pPr>
-      <w:r>
-        <w:rPr>
-          <w:b/>
-          <w:bCs/>
-          <w:sz w:val="24"/>
-          <w:szCs w:val="24"/>
-          <w:lang w:val="uk-UA"/>
-        </w:rPr>
-        <w:t>OS Interception:</w:t>
-      </w:r>
-      <w:r>
-        <w:rPr>
-          <w:sz w:val="24"/>
-          <w:szCs w:val="24"/>
-          <w:lang w:val="uk-UA"/>
-        </w:rPr>
-        <w:t> Because MMP links are technically wrapped as Universal Links (iOS) or App Links (Android) under the hood, the mobile OS recognizes the MMP domain. It intercepts the link and immediately brings the app to the foreground without opening the web browser.</w:t>
-      </w:r>
-    </w:p>
-    <w:p>
-      <w:pPr>
-        <w:numPr>
-          <w:ilvl w:val="0"/>
-          <w:numId w:val="39"/>
-        </w:numPr>
-        <w:rPr>
-          <w:sz w:val="24"/>
-          <w:szCs w:val="24"/>
-          <w:lang w:val="uk-UA"/>
-        </w:rPr>
-      </w:pPr>
-      <w:r>
-        <w:rPr>
-          <w:b/>
-          <w:bCs/>
-          <w:sz w:val="24"/>
-          <w:szCs w:val="24"/>
-          <w:lang w:val="uk-UA"/>
-        </w:rPr>
-        <w:t>SDK Parsing:</w:t>
-      </w:r>
-      <w:r>
-        <w:rPr>
-          <w:sz w:val="24"/>
-          <w:szCs w:val="24"/>
-          <w:lang w:val="uk-UA"/>
-        </w:rPr>
-        <w:t> As the app wakes up, the embedded MMP SDK (inside the React Native environment) intercepts the launch payload containing the original URL.</w:t>
-      </w:r>
-    </w:p>
-    <w:p>
-      <w:pPr>
-        <w:numPr>
-          <w:ilvl w:val="0"/>
-          <w:numId w:val="39"/>
-        </w:numPr>
-        <w:rPr>
-          <w:sz w:val="24"/>
-          <w:szCs w:val="24"/>
-          <w:lang w:val="uk-UA"/>
-        </w:rPr>
-      </w:pPr>
-      <w:r>
-        <w:rPr>
-          <w:b/>
-          <w:bCs/>
-          <w:sz w:val="24"/>
-          <w:szCs w:val="24"/>
-          <w:lang w:val="uk-UA"/>
-        </w:rPr>
-        <w:t>Direct Routing:</w:t>
-      </w:r>
-      <w:r>
-        <w:rPr>
-          <w:sz w:val="24"/>
-          <w:szCs w:val="24"/>
-          <w:lang w:val="uk-UA"/>
-        </w:rPr>
-        <w:t> The SDK extracts the roomID parameter and instantly passes it to the React Native state manager (e.g., NetworkContext). The app immediately connects the user to the game room without any server-side fingerprinting.</w:t>
-      </w:r>
-    </w:p>
-    <w:p>
-      <w:pPr>
-        <w:rPr>
-          <w:sz w:val="24"/>
-          <w:szCs w:val="24"/>
-          <w:lang w:val="uk-UA"/>
-        </w:rPr>
-      </w:pPr>
-      <w:r>
-        <w:rPr>
-          <w:b/>
-          <w:bCs/>
-          <w:sz w:val="24"/>
-          <w:szCs w:val="24"/>
-          <w:lang w:val="uk-UA"/>
-        </w:rPr>
-        <w:t>Path B: The Deferred "Handshake" Process (If Application is NOT Installed)</w:t>
-      </w:r>
-      <w:r>
-        <w:rPr>
-          <w:sz w:val="24"/>
-          <w:szCs w:val="24"/>
-          <w:lang w:val="uk-UA"/>
-        </w:rPr>
-        <w:t> Since App Stores do not natively share user data with developers during the installation process, MMPs use complex probabilistic matching logic to "link" a specific user to their original QR scan.</w:t>
-      </w:r>
-    </w:p>
-    <w:p>
-      <w:pPr>
-        <w:numPr>
-          <w:ilvl w:val="0"/>
-          <w:numId w:val="40"/>
-        </w:numPr>
-        <w:rPr>
-          <w:sz w:val="24"/>
-          <w:szCs w:val="24"/>
-          <w:lang w:val="uk-UA"/>
-        </w:rPr>
-      </w:pPr>
-      <w:r>
-        <w:rPr>
-          <w:b/>
-          <w:bCs/>
-          <w:sz w:val="24"/>
-          <w:szCs w:val="24"/>
-          <w:lang w:val="uk-UA"/>
-        </w:rPr>
-        <w:t>The Touchpoint (QR Scan):</w:t>
-      </w:r>
-      <w:r>
-        <w:rPr>
-          <w:sz w:val="24"/>
-          <w:szCs w:val="24"/>
-          <w:lang w:val="uk-UA"/>
-        </w:rPr>
-        <w:t> The user scans the QR code. Since the app is missing, the OS falls back to the web browser. The MMP server instantly captures a "fingerprint" of the device (IP address, OS version, device model) and associates it with the roomID.</w:t>
-      </w:r>
-    </w:p>
-    <w:p>
-      <w:pPr>
-        <w:numPr>
-          <w:ilvl w:val="0"/>
-          <w:numId w:val="40"/>
-        </w:numPr>
-        <w:rPr>
-          <w:sz w:val="24"/>
-          <w:szCs w:val="24"/>
-          <w:lang w:val="uk-UA"/>
-        </w:rPr>
-      </w:pPr>
-      <w:r>
-        <w:rPr>
-          <w:b/>
-          <w:bCs/>
-          <w:sz w:val="24"/>
-          <w:szCs w:val="24"/>
-          <w:lang w:val="uk-UA"/>
-        </w:rPr>
-        <w:t>The Store Journey:</w:t>
-      </w:r>
-      <w:r>
-        <w:rPr>
-          <w:sz w:val="24"/>
-          <w:szCs w:val="24"/>
-          <w:lang w:val="uk-UA"/>
-        </w:rPr>
-        <w:t> The MMP redirects the user to the App Store or Play Store. The MMP stays in the background, keeping the fingerprint active and waiting for a "conversion" signal.</w:t>
-      </w:r>
-    </w:p>
-    <w:p>
-      <w:pPr>
-        <w:numPr>
-          <w:ilvl w:val="0"/>
-          <w:numId w:val="40"/>
-        </w:numPr>
-        <w:rPr>
-          <w:sz w:val="24"/>
-          <w:szCs w:val="24"/>
-          <w:lang w:val="uk-UA"/>
-        </w:rPr>
-      </w:pPr>
-      <w:r>
-        <w:rPr>
-          <w:b/>
-          <w:bCs/>
-          <w:sz w:val="24"/>
-          <w:szCs w:val="24"/>
-          <w:lang w:val="uk-UA"/>
-        </w:rPr>
-        <w:t>The First Launch (The Match):</w:t>
-      </w:r>
-      <w:r>
-        <w:rPr>
-          <w:sz w:val="24"/>
-          <w:szCs w:val="24"/>
-          <w:lang w:val="uk-UA"/>
-        </w:rPr>
-        <w:t> The user installs and opens the app for the first time. The MMP SDK inside your app sends the current device data back to its server. The server matches this new data against the fingerprint captured in Step 1, says: </w:t>
-      </w:r>
-      <w:r>
-        <w:rPr>
-          <w:i/>
-          <w:iCs/>
-          <w:sz w:val="24"/>
-          <w:szCs w:val="24"/>
-          <w:lang w:val="uk-UA"/>
-        </w:rPr>
-        <w:t>"This is the same device that scanned 'Room XYZ' 2 minutes ago!"</w:t>
-      </w:r>
-      <w:r>
-        <w:rPr>
-          <w:sz w:val="24"/>
-          <w:szCs w:val="24"/>
-          <w:lang w:val="uk-UA"/>
-        </w:rPr>
-        <w:t> and pushes the roomID payload to the app to complete the connection.</w:t>
-      </w:r>
-    </w:p>
-    <w:p>
-      <w:pPr>
-        <w:ind w:left="720"/>
-        <w:rPr>
-          <w:lang w:val="uk-UA"/>
-        </w:rPr>
-      </w:pPr>
-    </w:p>
-    <w:p>
-      <w:pPr>
-        <w:rPr>
-          <w:sz w:val="24"/>
-          <w:szCs w:val="24"/>
-          <w:lang w:val="uk-UA"/>
-        </w:rPr>
-      </w:pPr>
-      <w:r>
-        <w:rPr>
-          <w:b/>
-          <w:bCs/>
-          <w:sz w:val="24"/>
-          <w:szCs w:val="24"/>
-        </w:rPr>
-        <w:t>Top MMP Providers in 2026:</w:t>
-      </w:r>
-    </w:p>
-    <w:tbl>
-      <w:tblPr>
-        <w:tblW w:w="0" w:type="auto"/>
-        <w:shd w:val="clear" w:color="auto" w:fill="FFFFFF"/>
-        <w:tblCellMar>
-          <w:top w:w="15" w:type="dxa"/>
-          <w:left w:w="15" w:type="dxa"/>
-          <w:bottom w:w="15" w:type="dxa"/>
-          <w:right w:w="15" w:type="dxa"/>
-        </w:tblCellMar>
-        <w:tblLook w:val="04A0" w:firstRow="1" w:lastRow="0" w:firstColumn="1" w:lastColumn="0" w:noHBand="0" w:noVBand="1"/>
-      </w:tblPr>
-      <w:tblGrid>
-        <w:gridCol w:w="1374"/>
-        <w:gridCol w:w="5819"/>
-        <w:gridCol w:w="3591"/>
-      </w:tblGrid>
-      <w:tr>
-        <w:trPr>
-          <w:tblHeader/>
-        </w:trPr>
-        <w:tc>
-          <w:tcPr>
-            <w:tcW w:w="0" w:type="auto"/>
-            <w:tcBorders>
-              <w:top w:val="single" w:sz="6" w:space="0" w:color="D1D9E0"/>
-              <w:left w:val="single" w:sz="6" w:space="0" w:color="D1D9E0"/>
-              <w:bottom w:val="single" w:sz="6" w:space="0" w:color="D1D9E0"/>
-              <w:right w:val="single" w:sz="6" w:space="0" w:color="D1D9E0"/>
-            </w:tcBorders>
-            <w:shd w:val="clear" w:color="auto" w:fill="FFFFFF"/>
-            <w:tcMar>
-              <w:top w:w="90" w:type="dxa"/>
-              <w:left w:w="195" w:type="dxa"/>
-              <w:bottom w:w="90" w:type="dxa"/>
-              <w:right w:w="195" w:type="dxa"/>
-            </w:tcMar>
-            <w:vAlign w:val="center"/>
-            <w:hideMark/>
-          </w:tcPr>
-          <w:p>
-            <w:pPr>
-              <w:rPr>
-                <w:b/>
-                <w:bCs/>
-                <w:sz w:val="24"/>
-                <w:szCs w:val="24"/>
-                <w:lang w:val="uk-UA"/>
-              </w:rPr>
-            </w:pPr>
-            <w:r>
-              <w:rPr>
-                <w:b/>
-                <w:bCs/>
-                <w:sz w:val="24"/>
-                <w:szCs w:val="24"/>
-                <w:lang w:val="uk-UA"/>
-              </w:rPr>
-              <w:lastRenderedPageBreak/>
-              <w:t>Provider</w:t>
-            </w:r>
-          </w:p>
-        </w:tc>
-        <w:tc>
-          <w:tcPr>
-            <w:tcW w:w="0" w:type="auto"/>
-            <w:tcBorders>
-              <w:top w:val="single" w:sz="6" w:space="0" w:color="D1D9E0"/>
-              <w:left w:val="single" w:sz="6" w:space="0" w:color="D1D9E0"/>
-              <w:bottom w:val="single" w:sz="6" w:space="0" w:color="D1D9E0"/>
-              <w:right w:val="single" w:sz="6" w:space="0" w:color="D1D9E0"/>
-            </w:tcBorders>
-            <w:shd w:val="clear" w:color="auto" w:fill="FFFFFF"/>
-            <w:tcMar>
-              <w:top w:w="90" w:type="dxa"/>
-              <w:left w:w="195" w:type="dxa"/>
-              <w:bottom w:w="90" w:type="dxa"/>
-              <w:right w:w="195" w:type="dxa"/>
-            </w:tcMar>
-            <w:vAlign w:val="center"/>
-            <w:hideMark/>
-          </w:tcPr>
-          <w:p>
-            <w:pPr>
-              <w:rPr>
-                <w:b/>
-                <w:bCs/>
-                <w:sz w:val="24"/>
-                <w:szCs w:val="24"/>
-                <w:lang w:val="uk-UA"/>
-              </w:rPr>
-            </w:pPr>
-            <w:r>
-              <w:rPr>
-                <w:b/>
-                <w:bCs/>
-                <w:sz w:val="24"/>
-                <w:szCs w:val="24"/>
-                <w:lang w:val="uk-UA"/>
-              </w:rPr>
-              <w:t>Best For...</w:t>
-            </w:r>
-          </w:p>
-        </w:tc>
-        <w:tc>
-          <w:tcPr>
-            <w:tcW w:w="0" w:type="auto"/>
-            <w:tcBorders>
-              <w:top w:val="single" w:sz="6" w:space="0" w:color="D1D9E0"/>
-              <w:left w:val="single" w:sz="6" w:space="0" w:color="D1D9E0"/>
-              <w:bottom w:val="single" w:sz="6" w:space="0" w:color="D1D9E0"/>
-              <w:right w:val="single" w:sz="6" w:space="0" w:color="D1D9E0"/>
-            </w:tcBorders>
-            <w:shd w:val="clear" w:color="auto" w:fill="FFFFFF"/>
-            <w:tcMar>
-              <w:top w:w="90" w:type="dxa"/>
-              <w:left w:w="195" w:type="dxa"/>
-              <w:bottom w:w="90" w:type="dxa"/>
-              <w:right w:w="195" w:type="dxa"/>
-            </w:tcMar>
-            <w:vAlign w:val="center"/>
-            <w:hideMark/>
-          </w:tcPr>
-          <w:p>
-            <w:pPr>
-              <w:rPr>
-                <w:b/>
-                <w:bCs/>
-                <w:sz w:val="24"/>
-                <w:szCs w:val="24"/>
-                <w:lang w:val="uk-UA"/>
-              </w:rPr>
-            </w:pPr>
-            <w:r>
-              <w:rPr>
-                <w:b/>
-                <w:bCs/>
-                <w:sz w:val="24"/>
-                <w:szCs w:val="24"/>
-                <w:lang w:val="uk-UA"/>
-              </w:rPr>
-              <w:t>Pricing Model</w:t>
-            </w:r>
-          </w:p>
-        </w:tc>
-      </w:tr>
-      <w:tr>
-        <w:tc>
-          <w:tcPr>
-            <w:tcW w:w="0" w:type="auto"/>
-            <w:tcBorders>
-              <w:top w:val="single" w:sz="6" w:space="0" w:color="D1D9E0"/>
-              <w:left w:val="single" w:sz="6" w:space="0" w:color="D1D9E0"/>
-              <w:bottom w:val="single" w:sz="6" w:space="0" w:color="D1D9E0"/>
-              <w:right w:val="single" w:sz="6" w:space="0" w:color="D1D9E0"/>
-            </w:tcBorders>
-            <w:shd w:val="clear" w:color="auto" w:fill="FFFFFF"/>
-            <w:tcMar>
-              <w:top w:w="90" w:type="dxa"/>
-              <w:left w:w="195" w:type="dxa"/>
-              <w:bottom w:w="90" w:type="dxa"/>
-              <w:right w:w="195" w:type="dxa"/>
-            </w:tcMar>
-            <w:vAlign w:val="center"/>
-            <w:hideMark/>
-          </w:tcPr>
-          <w:p>
-            <w:pPr>
-              <w:rPr>
-                <w:sz w:val="24"/>
-                <w:szCs w:val="24"/>
-                <w:lang w:val="uk-UA"/>
-              </w:rPr>
-            </w:pPr>
-            <w:r>
-              <w:rPr>
-                <w:b/>
-                <w:bCs/>
-                <w:sz w:val="24"/>
-                <w:szCs w:val="24"/>
-                <w:lang w:val="uk-UA"/>
-              </w:rPr>
-              <w:t>Branch.io</w:t>
-            </w:r>
-          </w:p>
-        </w:tc>
-        <w:tc>
-          <w:tcPr>
-            <w:tcW w:w="0" w:type="auto"/>
-            <w:tcBorders>
-              <w:top w:val="single" w:sz="6" w:space="0" w:color="D1D9E0"/>
-              <w:left w:val="single" w:sz="6" w:space="0" w:color="D1D9E0"/>
-              <w:bottom w:val="single" w:sz="6" w:space="0" w:color="D1D9E0"/>
-              <w:right w:val="single" w:sz="6" w:space="0" w:color="D1D9E0"/>
-            </w:tcBorders>
-            <w:shd w:val="clear" w:color="auto" w:fill="FFFFFF"/>
-            <w:tcMar>
-              <w:top w:w="90" w:type="dxa"/>
-              <w:left w:w="195" w:type="dxa"/>
-              <w:bottom w:w="90" w:type="dxa"/>
-              <w:right w:w="195" w:type="dxa"/>
-            </w:tcMar>
-            <w:vAlign w:val="center"/>
-            <w:hideMark/>
-          </w:tcPr>
-          <w:p>
-            <w:pPr>
-              <w:rPr>
-                <w:sz w:val="24"/>
-                <w:szCs w:val="24"/>
-                <w:lang w:val="uk-UA"/>
-              </w:rPr>
-            </w:pPr>
-            <w:r>
-              <w:rPr>
-                <w:sz w:val="24"/>
-                <w:szCs w:val="24"/>
-                <w:lang w:val="uk-UA"/>
-              </w:rPr>
-              <w:t>Deep Linking &amp; UX. They are the leaders in "Deferred Deep Linking" specifically.</w:t>
-            </w:r>
-          </w:p>
-        </w:tc>
-        <w:tc>
-          <w:tcPr>
-            <w:tcW w:w="0" w:type="auto"/>
-            <w:tcBorders>
-              <w:top w:val="single" w:sz="6" w:space="0" w:color="D1D9E0"/>
-              <w:left w:val="single" w:sz="6" w:space="0" w:color="D1D9E0"/>
-              <w:bottom w:val="single" w:sz="6" w:space="0" w:color="D1D9E0"/>
-              <w:right w:val="single" w:sz="6" w:space="0" w:color="D1D9E0"/>
-            </w:tcBorders>
-            <w:shd w:val="clear" w:color="auto" w:fill="FFFFFF"/>
-            <w:tcMar>
-              <w:top w:w="90" w:type="dxa"/>
-              <w:left w:w="195" w:type="dxa"/>
-              <w:bottom w:w="90" w:type="dxa"/>
-              <w:right w:w="195" w:type="dxa"/>
-            </w:tcMar>
-            <w:vAlign w:val="center"/>
-            <w:hideMark/>
-          </w:tcPr>
-          <w:p>
-            <w:pPr>
-              <w:rPr>
-                <w:sz w:val="24"/>
-                <w:szCs w:val="24"/>
-                <w:lang w:val="uk-UA"/>
-              </w:rPr>
-            </w:pPr>
-            <w:r>
-              <w:rPr>
-                <w:sz w:val="24"/>
-                <w:szCs w:val="24"/>
-                <w:lang w:val="uk-UA"/>
-              </w:rPr>
-              <w:t>Free tier available (good for startups).</w:t>
-            </w:r>
-          </w:p>
-        </w:tc>
-      </w:tr>
-      <w:tr>
-        <w:tc>
-          <w:tcPr>
-            <w:tcW w:w="0" w:type="auto"/>
-            <w:tcBorders>
-              <w:top w:val="single" w:sz="6" w:space="0" w:color="D1D9E0"/>
-              <w:left w:val="single" w:sz="6" w:space="0" w:color="D1D9E0"/>
-              <w:bottom w:val="single" w:sz="6" w:space="0" w:color="D1D9E0"/>
-              <w:right w:val="single" w:sz="6" w:space="0" w:color="D1D9E0"/>
-            </w:tcBorders>
-            <w:shd w:val="clear" w:color="auto" w:fill="F6F8FA"/>
-            <w:tcMar>
-              <w:top w:w="90" w:type="dxa"/>
-              <w:left w:w="195" w:type="dxa"/>
-              <w:bottom w:w="90" w:type="dxa"/>
-              <w:right w:w="195" w:type="dxa"/>
-            </w:tcMar>
-            <w:vAlign w:val="center"/>
-            <w:hideMark/>
-          </w:tcPr>
-          <w:p>
-            <w:pPr>
-              <w:rPr>
-                <w:sz w:val="24"/>
-                <w:szCs w:val="24"/>
-                <w:lang w:val="uk-UA"/>
-              </w:rPr>
-            </w:pPr>
-            <w:r>
-              <w:rPr>
-                <w:b/>
-                <w:bCs/>
-                <w:sz w:val="24"/>
-                <w:szCs w:val="24"/>
-                <w:lang w:val="uk-UA"/>
-              </w:rPr>
-              <w:t>AppsFlyer</w:t>
-            </w:r>
-          </w:p>
-        </w:tc>
-        <w:tc>
-          <w:tcPr>
-            <w:tcW w:w="0" w:type="auto"/>
-            <w:tcBorders>
-              <w:top w:val="single" w:sz="6" w:space="0" w:color="D1D9E0"/>
-              <w:left w:val="single" w:sz="6" w:space="0" w:color="D1D9E0"/>
-              <w:bottom w:val="single" w:sz="6" w:space="0" w:color="D1D9E0"/>
-              <w:right w:val="single" w:sz="6" w:space="0" w:color="D1D9E0"/>
-            </w:tcBorders>
-            <w:shd w:val="clear" w:color="auto" w:fill="F6F8FA"/>
-            <w:tcMar>
-              <w:top w:w="90" w:type="dxa"/>
-              <w:left w:w="195" w:type="dxa"/>
-              <w:bottom w:w="90" w:type="dxa"/>
-              <w:right w:w="195" w:type="dxa"/>
-            </w:tcMar>
-            <w:vAlign w:val="center"/>
-            <w:hideMark/>
-          </w:tcPr>
-          <w:p>
-            <w:pPr>
-              <w:rPr>
-                <w:sz w:val="24"/>
-                <w:szCs w:val="24"/>
-                <w:lang w:val="uk-UA"/>
-              </w:rPr>
-            </w:pPr>
-            <w:r>
-              <w:rPr>
-                <w:sz w:val="24"/>
-                <w:szCs w:val="24"/>
-                <w:lang w:val="uk-UA"/>
-              </w:rPr>
-              <w:t>Scale &amp; Fraud Protection. Used by major gaming studios.</w:t>
-            </w:r>
-          </w:p>
-        </w:tc>
-        <w:tc>
-          <w:tcPr>
-            <w:tcW w:w="0" w:type="auto"/>
-            <w:tcBorders>
-              <w:top w:val="single" w:sz="6" w:space="0" w:color="D1D9E0"/>
-              <w:left w:val="single" w:sz="6" w:space="0" w:color="D1D9E0"/>
-              <w:bottom w:val="single" w:sz="6" w:space="0" w:color="D1D9E0"/>
-              <w:right w:val="single" w:sz="6" w:space="0" w:color="D1D9E0"/>
-            </w:tcBorders>
-            <w:shd w:val="clear" w:color="auto" w:fill="F6F8FA"/>
-            <w:tcMar>
-              <w:top w:w="90" w:type="dxa"/>
-              <w:left w:w="195" w:type="dxa"/>
-              <w:bottom w:w="90" w:type="dxa"/>
-              <w:right w:w="195" w:type="dxa"/>
-            </w:tcMar>
-            <w:vAlign w:val="center"/>
-            <w:hideMark/>
-          </w:tcPr>
-          <w:p>
-            <w:pPr>
-              <w:rPr>
-                <w:sz w:val="24"/>
-                <w:szCs w:val="24"/>
-                <w:lang w:val="uk-UA"/>
-              </w:rPr>
-            </w:pPr>
-            <w:r>
-              <w:rPr>
-                <w:sz w:val="24"/>
-                <w:szCs w:val="24"/>
-                <w:lang w:val="uk-UA"/>
-              </w:rPr>
-              <w:t>Pay-per-conversion (can be expensive).</w:t>
-            </w:r>
-          </w:p>
-        </w:tc>
-      </w:tr>
-      <w:tr>
-        <w:tc>
-          <w:tcPr>
-            <w:tcW w:w="0" w:type="auto"/>
-            <w:tcBorders>
-              <w:top w:val="single" w:sz="6" w:space="0" w:color="D1D9E0"/>
-              <w:left w:val="single" w:sz="6" w:space="0" w:color="D1D9E0"/>
-              <w:bottom w:val="single" w:sz="6" w:space="0" w:color="D1D9E0"/>
-              <w:right w:val="single" w:sz="6" w:space="0" w:color="D1D9E0"/>
-            </w:tcBorders>
-            <w:shd w:val="clear" w:color="auto" w:fill="FFFFFF"/>
-            <w:tcMar>
-              <w:top w:w="90" w:type="dxa"/>
-              <w:left w:w="195" w:type="dxa"/>
-              <w:bottom w:w="90" w:type="dxa"/>
-              <w:right w:w="195" w:type="dxa"/>
-            </w:tcMar>
-            <w:vAlign w:val="center"/>
-            <w:hideMark/>
-          </w:tcPr>
-          <w:p>
-            <w:pPr>
-              <w:rPr>
-                <w:sz w:val="24"/>
-                <w:szCs w:val="24"/>
-                <w:lang w:val="uk-UA"/>
-              </w:rPr>
-            </w:pPr>
-            <w:r>
-              <w:rPr>
-                <w:b/>
-                <w:bCs/>
-                <w:sz w:val="24"/>
-                <w:szCs w:val="24"/>
-                <w:lang w:val="uk-UA"/>
-              </w:rPr>
-              <w:t>Adjust</w:t>
-            </w:r>
-          </w:p>
-        </w:tc>
-        <w:tc>
-          <w:tcPr>
-            <w:tcW w:w="0" w:type="auto"/>
-            <w:tcBorders>
-              <w:top w:val="single" w:sz="6" w:space="0" w:color="D1D9E0"/>
-              <w:left w:val="single" w:sz="6" w:space="0" w:color="D1D9E0"/>
-              <w:bottom w:val="single" w:sz="6" w:space="0" w:color="D1D9E0"/>
-              <w:right w:val="single" w:sz="6" w:space="0" w:color="D1D9E0"/>
-            </w:tcBorders>
-            <w:shd w:val="clear" w:color="auto" w:fill="FFFFFF"/>
-            <w:tcMar>
-              <w:top w:w="90" w:type="dxa"/>
-              <w:left w:w="195" w:type="dxa"/>
-              <w:bottom w:w="90" w:type="dxa"/>
-              <w:right w:w="195" w:type="dxa"/>
-            </w:tcMar>
-            <w:vAlign w:val="center"/>
-            <w:hideMark/>
-          </w:tcPr>
-          <w:p>
-            <w:pPr>
-              <w:rPr>
-                <w:sz w:val="24"/>
-                <w:szCs w:val="24"/>
-                <w:lang w:val="uk-UA"/>
-              </w:rPr>
-            </w:pPr>
-            <w:r>
-              <w:rPr>
-                <w:sz w:val="24"/>
-                <w:szCs w:val="24"/>
-                <w:lang w:val="uk-UA"/>
-              </w:rPr>
-              <w:t>Reliability &amp; Security. Very popular in Europe; great SDK support.</w:t>
-            </w:r>
-          </w:p>
-        </w:tc>
-        <w:tc>
-          <w:tcPr>
-            <w:tcW w:w="0" w:type="auto"/>
-            <w:tcBorders>
-              <w:top w:val="single" w:sz="6" w:space="0" w:color="D1D9E0"/>
-              <w:left w:val="single" w:sz="6" w:space="0" w:color="D1D9E0"/>
-              <w:bottom w:val="single" w:sz="6" w:space="0" w:color="D1D9E0"/>
-              <w:right w:val="single" w:sz="6" w:space="0" w:color="D1D9E0"/>
-            </w:tcBorders>
-            <w:shd w:val="clear" w:color="auto" w:fill="FFFFFF"/>
-            <w:tcMar>
-              <w:top w:w="90" w:type="dxa"/>
-              <w:left w:w="195" w:type="dxa"/>
-              <w:bottom w:w="90" w:type="dxa"/>
-              <w:right w:w="195" w:type="dxa"/>
-            </w:tcMar>
-            <w:vAlign w:val="center"/>
-            <w:hideMark/>
-          </w:tcPr>
-          <w:p>
-            <w:pPr>
-              <w:rPr>
-                <w:sz w:val="24"/>
-                <w:szCs w:val="24"/>
-                <w:lang w:val="uk-UA"/>
-              </w:rPr>
-            </w:pPr>
-            <w:r>
-              <w:rPr>
-                <w:sz w:val="24"/>
-                <w:szCs w:val="24"/>
-                <w:lang w:val="uk-UA"/>
-              </w:rPr>
-              <w:t>Subscription/Custom.</w:t>
-            </w:r>
-          </w:p>
-        </w:tc>
-      </w:tr>
-      <w:tr>
-        <w:tc>
-          <w:tcPr>
-            <w:tcW w:w="0" w:type="auto"/>
-            <w:tcBorders>
-              <w:top w:val="single" w:sz="6" w:space="0" w:color="D1D9E0"/>
-              <w:left w:val="single" w:sz="6" w:space="0" w:color="D1D9E0"/>
-              <w:bottom w:val="single" w:sz="6" w:space="0" w:color="D1D9E0"/>
-              <w:right w:val="single" w:sz="6" w:space="0" w:color="D1D9E0"/>
-            </w:tcBorders>
-            <w:shd w:val="clear" w:color="auto" w:fill="F6F8FA"/>
-            <w:tcMar>
-              <w:top w:w="90" w:type="dxa"/>
-              <w:left w:w="195" w:type="dxa"/>
-              <w:bottom w:w="90" w:type="dxa"/>
-              <w:right w:w="195" w:type="dxa"/>
-            </w:tcMar>
-            <w:vAlign w:val="center"/>
-            <w:hideMark/>
-          </w:tcPr>
-          <w:p>
-            <w:pPr>
-              <w:rPr>
-                <w:sz w:val="24"/>
-                <w:szCs w:val="24"/>
-                <w:lang w:val="uk-UA"/>
-              </w:rPr>
-            </w:pPr>
-            <w:r>
-              <w:rPr>
-                <w:b/>
-                <w:bCs/>
-                <w:sz w:val="24"/>
-                <w:szCs w:val="24"/>
-                <w:lang w:val="uk-UA"/>
-              </w:rPr>
-              <w:t>Tenjin</w:t>
-            </w:r>
-          </w:p>
-        </w:tc>
-        <w:tc>
-          <w:tcPr>
-            <w:tcW w:w="0" w:type="auto"/>
-            <w:tcBorders>
-              <w:top w:val="single" w:sz="6" w:space="0" w:color="D1D9E0"/>
-              <w:left w:val="single" w:sz="6" w:space="0" w:color="D1D9E0"/>
-              <w:bottom w:val="single" w:sz="6" w:space="0" w:color="D1D9E0"/>
-              <w:right w:val="single" w:sz="6" w:space="0" w:color="D1D9E0"/>
-            </w:tcBorders>
-            <w:shd w:val="clear" w:color="auto" w:fill="F6F8FA"/>
-            <w:tcMar>
-              <w:top w:w="90" w:type="dxa"/>
-              <w:left w:w="195" w:type="dxa"/>
-              <w:bottom w:w="90" w:type="dxa"/>
-              <w:right w:w="195" w:type="dxa"/>
-            </w:tcMar>
-            <w:vAlign w:val="center"/>
-            <w:hideMark/>
-          </w:tcPr>
-          <w:p>
-            <w:pPr>
-              <w:rPr>
-                <w:sz w:val="24"/>
-                <w:szCs w:val="24"/>
-                <w:lang w:val="uk-UA"/>
-              </w:rPr>
-            </w:pPr>
-            <w:r>
-              <w:rPr>
-                <w:sz w:val="24"/>
-                <w:szCs w:val="24"/>
-                <w:lang w:val="uk-UA"/>
-              </w:rPr>
-              <w:t>Indie Game Devs. Focuses on ROI and easy integration for small teams.</w:t>
-            </w:r>
-          </w:p>
-        </w:tc>
-        <w:tc>
-          <w:tcPr>
-            <w:tcW w:w="0" w:type="auto"/>
-            <w:tcBorders>
-              <w:top w:val="single" w:sz="6" w:space="0" w:color="D1D9E0"/>
-              <w:left w:val="single" w:sz="6" w:space="0" w:color="D1D9E0"/>
-              <w:bottom w:val="single" w:sz="6" w:space="0" w:color="D1D9E0"/>
-              <w:right w:val="single" w:sz="6" w:space="0" w:color="D1D9E0"/>
-            </w:tcBorders>
-            <w:shd w:val="clear" w:color="auto" w:fill="F6F8FA"/>
-            <w:tcMar>
-              <w:top w:w="90" w:type="dxa"/>
-              <w:left w:w="195" w:type="dxa"/>
-              <w:bottom w:w="90" w:type="dxa"/>
-              <w:right w:w="195" w:type="dxa"/>
-            </w:tcMar>
-            <w:vAlign w:val="center"/>
-            <w:hideMark/>
-          </w:tcPr>
-          <w:p>
-            <w:pPr>
-              <w:rPr>
-                <w:sz w:val="24"/>
-                <w:szCs w:val="24"/>
-                <w:lang w:val="uk-UA"/>
-              </w:rPr>
-            </w:pPr>
-            <w:r>
-              <w:rPr>
-                <w:sz w:val="24"/>
-                <w:szCs w:val="24"/>
-                <w:lang w:val="uk-UA"/>
-              </w:rPr>
-              <w:t>Freemium / Low cost.</w:t>
-            </w:r>
-          </w:p>
-        </w:tc>
-      </w:tr>
-    </w:tbl>
-    <w:p>
-      <w:pPr>
-        <w:rPr>
-          <w:lang w:val="uk-UA"/>
-        </w:rPr>
-      </w:pPr>
-    </w:p>
-    <w:p>
-      <w:pPr>
-        <w:sectPr>
-          <w:pgSz w:w="12240" w:h="15840"/>
-          <w:pgMar w:top="720" w:right="720" w:bottom="720" w:left="720" w:header="720" w:footer="720" w:gutter="0"/>
-          <w:cols w:space="720"/>
-          <w:docGrid w:linePitch="360"/>
-        </w:sectPr>
-      </w:pPr>
-    </w:p>
-    <w:p>
-      <w:pPr>
-        <w:pStyle w:val="Heading3"/>
-        <w:rPr>
-          <w:lang w:val="uk-UA"/>
-        </w:rPr>
-      </w:pPr>
-      <w:r>
-        <w:rPr>
-          <w:lang w:val="uk-UA"/>
-        </w:rPr>
-        <w:lastRenderedPageBreak/>
-        <w:t>Method 2: Universal Links (iOS) &amp; App Links (Android)</w:t>
-      </w:r>
-    </w:p>
-    <w:p>
-      <w:pPr>
-        <w:rPr>
-          <w:sz w:val="24"/>
-          <w:szCs w:val="24"/>
-          <w:lang w:val="uk-UA"/>
-        </w:rPr>
-      </w:pPr>
-      <w:r>
-        <w:rPr>
-          <w:sz w:val="24"/>
-          <w:szCs w:val="24"/>
-          <w:lang w:val="uk-UA"/>
-        </w:rPr>
-        <w:t xml:space="preserve">This technical specification defines the implementation of Universal Links (iOS) and App Links (Android). </w:t>
-      </w:r>
-      <w:r>
-        <w:rPr>
-          <w:sz w:val="24"/>
-          <w:szCs w:val="24"/>
-        </w:rPr>
-        <w:t>T</w:t>
-      </w:r>
-      <w:r>
-        <w:rPr>
-          <w:sz w:val="24"/>
-          <w:szCs w:val="24"/>
-          <w:lang w:val="uk-UA"/>
-        </w:rPr>
-        <w:t>hese</w:t>
-      </w:r>
-      <w:r>
-        <w:rPr>
-          <w:sz w:val="24"/>
-          <w:szCs w:val="24"/>
-        </w:rPr>
-        <w:t xml:space="preserve"> </w:t>
-      </w:r>
-      <w:r>
-        <w:rPr>
-          <w:sz w:val="24"/>
-          <w:szCs w:val="24"/>
-          <w:lang w:val="uk-UA"/>
-        </w:rPr>
-        <w:t>are OS-level standards that use verified domain ownership to route users directly to the native application without leaving the current context.</w:t>
-      </w:r>
-    </w:p>
-    <w:p>
-      <w:pPr>
-        <w:rPr>
-          <w:sz w:val="24"/>
-          <w:szCs w:val="24"/>
-          <w:lang w:val="uk-UA"/>
-        </w:rPr>
-      </w:pPr>
-      <w:r>
-        <w:rPr>
-          <w:b/>
-          <w:bCs/>
-          <w:sz w:val="24"/>
-          <w:szCs w:val="24"/>
-          <w:lang w:val="uk-UA"/>
-        </w:rPr>
-        <w:t>1. Overview</w:t>
-      </w:r>
-      <w:r>
-        <w:rPr>
-          <w:sz w:val="24"/>
-          <w:szCs w:val="24"/>
-          <w:lang w:val="uk-UA"/>
-        </w:rPr>
-        <w:t> Universal Links (iOS) and App Links (Android) allow a standard HTTPS URL (e.g., https://yourgame.com/join?</w:t>
-      </w:r>
-      <w:r>
-        <w:rPr>
-          <w:sz w:val="24"/>
-          <w:szCs w:val="24"/>
         </w:rPr>
         <w:t>roomId</w:t>
       </w:r>
+      <w:proofErr w:type="spellEnd"/>
       <w:r>
         <w:rPr>
           <w:sz w:val="24"/>
@@ -2841,7 +1836,29 @@
           <w:szCs w:val="24"/>
           <w:lang w:val="uk-UA"/>
         </w:rPr>
-        <w:t>A. iOS: apple-app-site-association (AASA)</w:t>
+        <w:t>A. iOS: </w:t>
+      </w:r>
+      <w:r>
+        <w:rPr>
+          <w:b/>
+          <w:bCs/>
+          <w:i/>
+          <w:iCs/>
+          <w:sz w:val="24"/>
+          <w:szCs w:val="24"/>
+          <w:lang w:val="uk-UA"/>
+        </w:rPr>
+        <w:t>apple-app-site-association</w:t>
+      </w:r>
+      <w:r>
+        <w:rPr>
+          <w:b/>
+          <w:bCs/>
+          <w:sz w:val="24"/>
+          <w:szCs w:val="24"/>
+          <w:lang w:val="uk-UA"/>
+        </w:rPr>
+        <w:t> (AASA)</w:t>
       </w:r>
     </w:p>
     <w:p>
@@ -2862,7 +1879,25 @@
           <w:szCs w:val="24"/>
           <w:lang w:val="uk-UA"/>
         </w:rPr>
-        <w:t>File Name: apple-app-site-association (No extension).</w:t>
+        <w:t>File Name: </w:t>
+      </w:r>
+      <w:r>
+        <w:rPr>
+          <w:i/>
+          <w:iCs/>
+          <w:sz w:val="24"/>
+          <w:szCs w:val="24"/>
+          <w:lang w:val="uk-UA"/>
+        </w:rPr>
+        <w:t>apple-app-site-association</w:t>
+      </w:r>
+      <w:r>
+        <w:rPr>
+          <w:sz w:val="24"/>
+          <w:szCs w:val="24"/>
+          <w:lang w:val="uk-UA"/>
+        </w:rPr>
+        <w:t> (No extension).</w:t>
       </w:r>
     </w:p>
     <w:p>
@@ -2948,7 +1983,25 @@
           <w:szCs w:val="24"/>
           <w:lang w:val="uk-UA"/>
         </w:rPr>
-        <w:t>File Name: assetlinks.json.</w:t>
+        <w:t>File Name: </w:t>
+      </w:r>
+      <w:r>
+        <w:rPr>
+          <w:i/>
+          <w:iCs/>
+          <w:sz w:val="24"/>
+          <w:szCs w:val="24"/>
+          <w:lang w:val="uk-UA"/>
+        </w:rPr>
+        <w:t>assetlinks.json</w:t>
+      </w:r>
+      <w:r>
+        <w:rPr>
+          <w:sz w:val="24"/>
+          <w:szCs w:val="24"/>
+          <w:lang w:val="uk-UA"/>
+        </w:rPr>
+        <w:t>.</w:t>
       </w:r>
     </w:p>
     <w:p>
@@ -3128,13 +2181,19 @@
         </w:rPr>
         <w:t>The app parses </w:t>
       </w:r>
-      <w:r>
-        <w:rPr>
+      <w:proofErr w:type="spellStart"/>
+      <w:r>
+        <w:rPr>
+          <w:b/>
+          <w:bCs/>
+          <w:i/>
+          <w:iCs/>
           <w:sz w:val="24"/>
           <w:szCs w:val="24"/>
         </w:rPr>
         <w:t>roomId</w:t>
       </w:r>
+      <w:proofErr w:type="spellEnd"/>
       <w:r>
         <w:rPr>
           <w:sz w:val="24"/>
@@ -3214,6 +2273,7 @@
           <w:szCs w:val="24"/>
           <w:lang w:val="uk-UA"/>
         </w:rPr>
+        <w:lastRenderedPageBreak/>
         <w:t>The Redirector page loads and captures Fingerprint FP1.</w:t>
       </w:r>
     </w:p>
@@ -3235,7 +2295,6 @@
           <w:szCs w:val="24"/>
           <w:lang w:val="uk-UA"/>
         </w:rPr>
-        <w:lastRenderedPageBreak/>
         <w:t>The server saves the context with a 30-minute TTL.</w:t>
       </w:r>
     </w:p>
@@ -3419,7 +2478,7 @@
           <w:noProof/>
         </w:rPr>
         <w:drawing>
-          <wp:inline distT="0" distB="0" distL="0" distR="0" wp14:anchorId="08BC2AAD" wp14:editId="38FF3BC8">
+          <wp:inline distT="0" distB="0" distL="0" distR="0" wp14:anchorId="08BC2AAD" wp14:editId="1934A70A">
             <wp:extent cx="5943600" cy="4356509"/>
             <wp:effectExtent l="0" t="0" r="0" b="6350"/>
             <wp:docPr id="1809183539" name="Picture 1"/>
@@ -3479,51 +2538,20 @@
     <w:p>
       <w:pPr>
         <w:rPr>
+          <w:sz w:val="24"/>
+          <w:szCs w:val="24"/>
+          <w:lang w:val="uk-UA"/>
+        </w:rPr>
+      </w:pPr>
+      <w:r>
+        <w:rPr>
           <w:b/>
           <w:bCs/>
-        </w:rPr>
-      </w:pPr>
-    </w:p>
-    <w:p>
-      <w:pPr>
-        <w:rPr>
-          <w:b/>
-          <w:bCs/>
-        </w:rPr>
-      </w:pPr>
-    </w:p>
-    <w:p>
-      <w:pPr>
-        <w:rPr>
-          <w:b/>
-          <w:bCs/>
-        </w:rPr>
-      </w:pPr>
-    </w:p>
-    <w:p>
-      <w:pPr>
-        <w:rPr>
-          <w:b/>
-          <w:bCs/>
-        </w:rPr>
-      </w:pPr>
-    </w:p>
-    <w:p>
-      <w:pPr>
-        <w:rPr>
-          <w:sz w:val="24"/>
-          <w:szCs w:val="24"/>
-          <w:lang w:val="uk-UA"/>
-        </w:rPr>
-      </w:pPr>
-      <w:r>
-        <w:rPr>
-          <w:b/>
-          <w:bCs/>
-          <w:sz w:val="24"/>
-          <w:szCs w:val="24"/>
-          <w:lang w:val="uk-UA"/>
-        </w:rPr>
+          <w:sz w:val="24"/>
+          <w:szCs w:val="24"/>
+          <w:lang w:val="uk-UA"/>
+        </w:rPr>
+        <w:lastRenderedPageBreak/>
         <w:t>Pros vs. Cons (Universal/App Links):</w:t>
       </w:r>
     </w:p>
@@ -4124,6 +3152,9 @@
         <w:pStyle w:val="Heading1"/>
       </w:pPr>
     </w:p>
+    <w:p/>
+    <w:p/>
+    <w:p/>
     <w:p>
       <w:pPr>
         <w:pStyle w:val="Heading1"/>
@@ -4135,6 +3166,7 @@
         <w:rPr>
           <w:lang w:val="uk-UA"/>
         </w:rPr>
+        <w:lastRenderedPageBreak/>
         <w:t>4. UI Engine &amp; Component Library</w:t>
       </w:r>
     </w:p>
@@ -5155,7 +4187,6 @@
           <w:szCs w:val="24"/>
           <w:lang w:val="uk-UA"/>
         </w:rPr>
-        <w:lastRenderedPageBreak/>
         <w:t>Text</w:t>
       </w:r>
     </w:p>
@@ -5198,6 +4229,7 @@
           <w:szCs w:val="24"/>
           <w:lang w:val="uk-UA"/>
         </w:rPr>
+        <w:lastRenderedPageBreak/>
         <w:t>visible (boolean): Visibility</w:t>
       </w:r>
     </w:p>
@@ -5443,7 +4475,25 @@
           <w:sz w:val="24"/>
           <w:szCs w:val="24"/>
         </w:rPr>
-        <w:t xml:space="preserve">    "screenId": "CONTROL_SCREEN"</w:t>
+        <w:t xml:space="preserve">    "</w:t>
+      </w:r>
+      <w:proofErr w:type="spellStart"/>
+      <w:r>
+        <w:rPr>
+          <w:rStyle w:val="FunctionTok"/>
+          <w:sz w:val="24"/>
+          <w:szCs w:val="24"/>
+        </w:rPr>
+        <w:t>screenId</w:t>
+      </w:r>
+      <w:proofErr w:type="spellEnd"/>
+      <w:r>
+        <w:rPr>
+          <w:rStyle w:val="FunctionTok"/>
+          <w:sz w:val="24"/>
+          <w:szCs w:val="24"/>
+        </w:rPr>
+        <w:t>": "CONTROL_SCREEN"</w:t>
       </w:r>
     </w:p>
     <w:p>
@@ -5613,8 +4663,62 @@
           <w:sz w:val="24"/>
           <w:szCs w:val="24"/>
         </w:rPr>
+        <w:t xml:space="preserve">  "type": "SET_SCREEN",</w:t>
+      </w:r>
+    </w:p>
+    <w:p>
+      <w:pPr>
+        <w:pStyle w:val="SourceCode"/>
+        <w:rPr>
+          <w:rStyle w:val="FunctionTok"/>
+          <w:sz w:val="24"/>
+          <w:szCs w:val="24"/>
+        </w:rPr>
+      </w:pPr>
+      <w:r>
+        <w:rPr>
+          <w:rStyle w:val="FunctionTok"/>
+          <w:sz w:val="24"/>
+          <w:szCs w:val="24"/>
+        </w:rPr>
+        <w:t xml:space="preserve">  "data": {</w:t>
+      </w:r>
+    </w:p>
+    <w:p>
+      <w:pPr>
+        <w:pStyle w:val="SourceCode"/>
+        <w:rPr>
+          <w:rStyle w:val="FunctionTok"/>
+          <w:sz w:val="24"/>
+          <w:szCs w:val="24"/>
+        </w:rPr>
+      </w:pPr>
+      <w:r>
+        <w:rPr>
+          <w:rStyle w:val="FunctionTok"/>
+          <w:sz w:val="24"/>
+          <w:szCs w:val="24"/>
+        </w:rPr>
         <w:lastRenderedPageBreak/>
-        <w:t xml:space="preserve">  "type": "SET_SCREEN",</w:t>
+        <w:t xml:space="preserve">    "</w:t>
+      </w:r>
+      <w:proofErr w:type="spellStart"/>
+      <w:r>
+        <w:rPr>
+          <w:rStyle w:val="FunctionTok"/>
+          <w:sz w:val="24"/>
+          <w:szCs w:val="24"/>
+        </w:rPr>
+        <w:t>screenId</w:t>
+      </w:r>
+      <w:proofErr w:type="spellEnd"/>
+      <w:r>
+        <w:rPr>
+          <w:rStyle w:val="FunctionTok"/>
+          <w:sz w:val="24"/>
+          <w:szCs w:val="24"/>
+        </w:rPr>
+        <w:t>": "CONTROL_SCREEN",</w:t>
       </w:r>
     </w:p>
     <w:p>
@@ -5632,7 +4736,7 @@
           <w:sz w:val="24"/>
           <w:szCs w:val="24"/>
         </w:rPr>
-        <w:t xml:space="preserve">  "data": {</w:t>
+        <w:t xml:space="preserve">    "components": {</w:t>
       </w:r>
     </w:p>
     <w:p>
@@ -5650,7 +4754,35 @@
           <w:sz w:val="24"/>
           <w:szCs w:val="24"/>
         </w:rPr>
-        <w:t xml:space="preserve">    "screenId": "CONTROL_SCREEN",</w:t>
+        <w:t xml:space="preserve">      "</w:t>
+      </w:r>
+      <w:proofErr w:type="spellStart"/>
+      <w:proofErr w:type="gramStart"/>
+      <w:r>
+        <w:rPr>
+          <w:rStyle w:val="FunctionTok"/>
+          <w:sz w:val="24"/>
+          <w:szCs w:val="24"/>
+        </w:rPr>
+        <w:t>player</w:t>
+      </w:r>
+      <w:proofErr w:type="gramEnd"/>
+      <w:r>
+        <w:rPr>
+          <w:rStyle w:val="FunctionTok"/>
+          <w:sz w:val="24"/>
+          <w:szCs w:val="24"/>
+        </w:rPr>
+        <w:t>_name</w:t>
+      </w:r>
+      <w:proofErr w:type="spellEnd"/>
+      <w:r>
+        <w:rPr>
+          <w:rStyle w:val="FunctionTok"/>
+          <w:sz w:val="24"/>
+          <w:szCs w:val="24"/>
+        </w:rPr>
+        <w:t>": { "content": "John" },</w:t>
       </w:r>
     </w:p>
     <w:p>
@@ -5668,43 +4800,35 @@
           <w:sz w:val="24"/>
           <w:szCs w:val="24"/>
         </w:rPr>
-        <w:t xml:space="preserve">    "components": {</w:t>
-      </w:r>
-    </w:p>
-    <w:p>
-      <w:pPr>
-        <w:pStyle w:val="SourceCode"/>
+        <w:t xml:space="preserve">      "</w:t>
+      </w:r>
+      <w:proofErr w:type="spellStart"/>
+      <w:proofErr w:type="gramStart"/>
+      <w:r>
         <w:rPr>
           <w:rStyle w:val="FunctionTok"/>
           <w:sz w:val="24"/>
           <w:szCs w:val="24"/>
         </w:rPr>
-      </w:pPr>
+        <w:t>fire</w:t>
+      </w:r>
+      <w:proofErr w:type="gramEnd"/>
       <w:r>
         <w:rPr>
           <w:rStyle w:val="FunctionTok"/>
           <w:sz w:val="24"/>
           <w:szCs w:val="24"/>
         </w:rPr>
-        <w:t xml:space="preserve">      "player_name": { "content": "John" },</w:t>
-      </w:r>
-    </w:p>
-    <w:p>
-      <w:pPr>
-        <w:pStyle w:val="SourceCode"/>
+        <w:t>_btn</w:t>
+      </w:r>
+      <w:proofErr w:type="spellEnd"/>
+      <w:r>
         <w:rPr>
           <w:rStyle w:val="FunctionTok"/>
           <w:sz w:val="24"/>
           <w:szCs w:val="24"/>
         </w:rPr>
-      </w:pPr>
-      <w:r>
-        <w:rPr>
-          <w:rStyle w:val="FunctionTok"/>
-          <w:sz w:val="24"/>
-          <w:szCs w:val="24"/>
-        </w:rPr>
-        <w:t xml:space="preserve">      "fire_btn": { "disabled": false }</w:t>
+        <w:t>": { "disabled": false }</w:t>
       </w:r>
     </w:p>
     <w:p>
@@ -5940,7 +5064,35 @@
           <w:sz w:val="24"/>
           <w:szCs w:val="24"/>
         </w:rPr>
-        <w:t xml:space="preserve">      "server_message": { </w:t>
+        <w:t xml:space="preserve">      "</w:t>
+      </w:r>
+      <w:proofErr w:type="spellStart"/>
+      <w:proofErr w:type="gramStart"/>
+      <w:r>
+        <w:rPr>
+          <w:rStyle w:val="FunctionTok"/>
+          <w:sz w:val="24"/>
+          <w:szCs w:val="24"/>
+        </w:rPr>
+        <w:t>server</w:t>
+      </w:r>
+      <w:proofErr w:type="gramEnd"/>
+      <w:r>
+        <w:rPr>
+          <w:rStyle w:val="FunctionTok"/>
+          <w:sz w:val="24"/>
+          <w:szCs w:val="24"/>
+        </w:rPr>
+        <w:t>_message</w:t>
+      </w:r>
+      <w:proofErr w:type="spellEnd"/>
+      <w:r>
+        <w:rPr>
+          <w:rStyle w:val="FunctionTok"/>
+          <w:sz w:val="24"/>
+          <w:szCs w:val="24"/>
+        </w:rPr>
+        <w:t xml:space="preserve">": { </w:t>
       </w:r>
     </w:p>
     <w:p>
@@ -5976,7 +5128,25 @@
           <w:sz w:val="24"/>
           <w:szCs w:val="24"/>
         </w:rPr>
-        <w:t xml:space="preserve">        "style": { "color": "white", "fontSize": 60 }</w:t>
+        <w:t xml:space="preserve">        "style": { "color": "white", "</w:t>
+      </w:r>
+      <w:proofErr w:type="spellStart"/>
+      <w:r>
+        <w:rPr>
+          <w:rStyle w:val="FunctionTok"/>
+          <w:sz w:val="24"/>
+          <w:szCs w:val="24"/>
+        </w:rPr>
+        <w:t>fontSize</w:t>
+      </w:r>
+      <w:proofErr w:type="spellEnd"/>
+      <w:r>
+        <w:rPr>
+          <w:rStyle w:val="FunctionTok"/>
+          <w:sz w:val="24"/>
+          <w:szCs w:val="24"/>
+        </w:rPr>
+        <w:t>": 60 }</w:t>
       </w:r>
     </w:p>
     <w:p>
@@ -6012,7 +5182,35 @@
           <w:sz w:val="24"/>
           <w:szCs w:val="24"/>
         </w:rPr>
-        <w:t xml:space="preserve">      "submit_btn": { "disabled": true },</w:t>
+        <w:t xml:space="preserve">      "</w:t>
+      </w:r>
+      <w:proofErr w:type="spellStart"/>
+      <w:proofErr w:type="gramStart"/>
+      <w:r>
+        <w:rPr>
+          <w:rStyle w:val="FunctionTok"/>
+          <w:sz w:val="24"/>
+          <w:szCs w:val="24"/>
+        </w:rPr>
+        <w:t>submit</w:t>
+      </w:r>
+      <w:proofErr w:type="gramEnd"/>
+      <w:r>
+        <w:rPr>
+          <w:rStyle w:val="FunctionTok"/>
+          <w:sz w:val="24"/>
+          <w:szCs w:val="24"/>
+        </w:rPr>
+        <w:t>_btn</w:t>
+      </w:r>
+      <w:proofErr w:type="spellEnd"/>
+      <w:r>
+        <w:rPr>
+          <w:rStyle w:val="FunctionTok"/>
+          <w:sz w:val="24"/>
+          <w:szCs w:val="24"/>
+        </w:rPr>
+        <w:t>": { "disabled": true },</w:t>
       </w:r>
     </w:p>
     <w:p>
@@ -6030,7 +5228,35 @@
           <w:sz w:val="24"/>
           <w:szCs w:val="24"/>
         </w:rPr>
-        <w:t xml:space="preserve">      "fire_btn": { "visible": true },</w:t>
+        <w:t xml:space="preserve">      "</w:t>
+      </w:r>
+      <w:proofErr w:type="spellStart"/>
+      <w:proofErr w:type="gramStart"/>
+      <w:r>
+        <w:rPr>
+          <w:rStyle w:val="FunctionTok"/>
+          <w:sz w:val="24"/>
+          <w:szCs w:val="24"/>
+        </w:rPr>
+        <w:t>fire</w:t>
+      </w:r>
+      <w:proofErr w:type="gramEnd"/>
+      <w:r>
+        <w:rPr>
+          <w:rStyle w:val="FunctionTok"/>
+          <w:sz w:val="24"/>
+          <w:szCs w:val="24"/>
+        </w:rPr>
+        <w:t>_btn</w:t>
+      </w:r>
+      <w:proofErr w:type="spellEnd"/>
+      <w:r>
+        <w:rPr>
+          <w:rStyle w:val="FunctionTok"/>
+          <w:sz w:val="24"/>
+          <w:szCs w:val="24"/>
+        </w:rPr>
+        <w:t>": { "visible": true },</w:t>
       </w:r>
     </w:p>
     <w:p>
@@ -6048,7 +5274,35 @@
           <w:sz w:val="24"/>
           <w:szCs w:val="24"/>
         </w:rPr>
-        <w:t xml:space="preserve">      "some_img": { "texture": "https://...", "visible": true }</w:t>
+        <w:t xml:space="preserve">      "</w:t>
+      </w:r>
+      <w:proofErr w:type="spellStart"/>
+      <w:proofErr w:type="gramStart"/>
+      <w:r>
+        <w:rPr>
+          <w:rStyle w:val="FunctionTok"/>
+          <w:sz w:val="24"/>
+          <w:szCs w:val="24"/>
+        </w:rPr>
+        <w:t>some</w:t>
+      </w:r>
+      <w:proofErr w:type="gramEnd"/>
+      <w:r>
+        <w:rPr>
+          <w:rStyle w:val="FunctionTok"/>
+          <w:sz w:val="24"/>
+          <w:szCs w:val="24"/>
+        </w:rPr>
+        <w:t>_img</w:t>
+      </w:r>
+      <w:proofErr w:type="spellEnd"/>
+      <w:r>
+        <w:rPr>
+          <w:rStyle w:val="FunctionTok"/>
+          <w:sz w:val="24"/>
+          <w:szCs w:val="24"/>
+        </w:rPr>
+        <w:t>": { "texture": "https://...", "visible": true }</w:t>
       </w:r>
     </w:p>
     <w:p>
@@ -6119,32 +5373,32 @@
           <w:sz w:val="24"/>
           <w:szCs w:val="24"/>
         </w:rPr>
+        <w:t>REQUEST_FULL_STATE_SYNC</w:t>
+      </w:r>
+      <w:r>
+        <w:rPr>
+          <w:sz w:val="24"/>
+          <w:szCs w:val="24"/>
+        </w:rPr>
+        <w:t> Request the current game state (e.g., after the application emerges from sleep).</w:t>
+      </w:r>
+    </w:p>
+    <w:p>
+      <w:pPr>
+        <w:pStyle w:val="SourceCode"/>
+        <w:rPr>
+          <w:rStyle w:val="FunctionTok"/>
+          <w:sz w:val="24"/>
+          <w:szCs w:val="24"/>
+        </w:rPr>
+      </w:pPr>
+      <w:r>
+        <w:rPr>
+          <w:rStyle w:val="FunctionTok"/>
+          <w:sz w:val="24"/>
+          <w:szCs w:val="24"/>
+        </w:rPr>
         <w:lastRenderedPageBreak/>
-        <w:t>REQUEST_FULL_STATE_SYNC</w:t>
-      </w:r>
-      <w:r>
-        <w:rPr>
-          <w:sz w:val="24"/>
-          <w:szCs w:val="24"/>
-        </w:rPr>
-        <w:t> Request the current game state (e.g., after the application emerges from sleep).</w:t>
-      </w:r>
-    </w:p>
-    <w:p>
-      <w:pPr>
-        <w:pStyle w:val="SourceCode"/>
-        <w:rPr>
-          <w:rStyle w:val="FunctionTok"/>
-          <w:sz w:val="24"/>
-          <w:szCs w:val="24"/>
-        </w:rPr>
-      </w:pPr>
-      <w:r>
-        <w:rPr>
-          <w:rStyle w:val="FunctionTok"/>
-          <w:sz w:val="24"/>
-          <w:szCs w:val="24"/>
-        </w:rPr>
         <w:t>{</w:t>
       </w:r>
     </w:p>

</xml_diff>

<commit_message>
fix(assetsloader): fix assets preload
chore(project): app.json & App.tsx
docs(project): document updated
</commit_message>
<xml_diff>
--- a/mrc_tech_design.docx
+++ b/mrc_tech_design.docx
@@ -282,46 +282,1092 @@
     <w:p/>
     <w:p/>
     <w:p/>
+    <w:p>
+      <w:pPr>
+        <w:pStyle w:val="Heading1"/>
+        <w:rPr>
+          <w:lang w:val="uk-UA"/>
+        </w:rPr>
+      </w:pPr>
+      <w:r>
+        <w:lastRenderedPageBreak/>
+        <w:t xml:space="preserve">2. </w:t>
+      </w:r>
+      <w:r>
+        <w:t>User Flows &amp; Deep Linking Methods</w:t>
+      </w:r>
+    </w:p>
+    <w:p>
+      <w:pPr>
+        <w:rPr>
+          <w:sz w:val="24"/>
+          <w:szCs w:val="24"/>
+          <w:lang w:val="uk-UA"/>
+        </w:rPr>
+      </w:pPr>
+      <w:r>
+        <w:rPr>
+          <w:sz w:val="24"/>
+          <w:szCs w:val="24"/>
+          <w:lang w:val="uk-UA"/>
+        </w:rPr>
+        <w:t>This section defines the entry points into the application, mapping out the connection flow from a physical touchpoint (QR code) to active gameplay.</w:t>
+      </w:r>
+    </w:p>
+    <w:p>
+      <w:pPr>
+        <w:pStyle w:val="Heading2"/>
+        <w:rPr>
+          <w:lang w:val="uk-UA"/>
+        </w:rPr>
+      </w:pPr>
+      <w:r>
+        <w:t>2</w:t>
+      </w:r>
+      <w:r>
+        <w:rPr>
+          <w:lang w:val="uk-UA"/>
+        </w:rPr>
+        <w:t>.1 Generic Flow Diagram</w:t>
+      </w:r>
+    </w:p>
     <w:p/>
-    <w:p/>
-    <w:p/>
-    <w:p/>
-    <w:p>
-      <w:pPr>
+    <w:p>
+      <w:pPr>
+        <w:jc w:val="center"/>
+      </w:pPr>
+      <w:r>
+        <w:rPr>
+          <w:noProof/>
+          <w:lang w:val="uk-UA"/>
+        </w:rPr>
+        <w:drawing>
+          <wp:inline distT="0" distB="0" distL="0" distR="0" wp14:anchorId="4C62B32C" wp14:editId="01807AB3">
+            <wp:extent cx="4391130" cy="6640497"/>
+            <wp:effectExtent l="0" t="0" r="0" b="8255"/>
+            <wp:docPr id="1162592027" name="Picture 1"/>
+            <wp:cNvGraphicFramePr>
+              <a:graphicFrameLocks xmlns:a="http://schemas.openxmlformats.org/drawingml/2006/main" noChangeAspect="1"/>
+            </wp:cNvGraphicFramePr>
+            <a:graphic xmlns:a="http://schemas.openxmlformats.org/drawingml/2006/main">
+              <a:graphicData uri="http://schemas.openxmlformats.org/drawingml/2006/picture">
+                <pic:pic xmlns:pic="http://schemas.openxmlformats.org/drawingml/2006/picture">
+                  <pic:nvPicPr>
+                    <pic:cNvPr id="0" name="Picture 1"/>
+                    <pic:cNvPicPr>
+                      <a:picLocks noChangeAspect="1" noChangeArrowheads="1"/>
+                    </pic:cNvPicPr>
+                  </pic:nvPicPr>
+                  <pic:blipFill>
+                    <a:blip r:embed="rId7">
+                      <a:extLst>
+                        <a:ext uri="{28A0092B-C50C-407E-A947-70E740481C1C}">
+                          <a14:useLocalDpi xmlns:a14="http://schemas.microsoft.com/office/drawing/2010/main" val="0"/>
+                        </a:ext>
+                      </a:extLst>
+                    </a:blip>
+                    <a:srcRect/>
+                    <a:stretch>
+                      <a:fillRect/>
+                    </a:stretch>
+                  </pic:blipFill>
+                  <pic:spPr bwMode="auto">
+                    <a:xfrm>
+                      <a:off x="0" y="0"/>
+                      <a:ext cx="4406973" cy="6664455"/>
+                    </a:xfrm>
+                    <a:prstGeom prst="rect">
+                      <a:avLst/>
+                    </a:prstGeom>
+                    <a:noFill/>
+                    <a:ln>
+                      <a:noFill/>
+                    </a:ln>
+                  </pic:spPr>
+                </pic:pic>
+              </a:graphicData>
+            </a:graphic>
+          </wp:inline>
+        </w:drawing>
+      </w:r>
+    </w:p>
+    <w:p>
+      <w:pPr>
+        <w:pStyle w:val="Heading2"/>
+      </w:pPr>
+      <w:r>
+        <w:lastRenderedPageBreak/>
+        <w:t>2</w:t>
+      </w:r>
+      <w:r>
+        <w:rPr>
+          <w:lang w:val="uk-UA"/>
+        </w:rPr>
+        <w:t xml:space="preserve">.2 Detailed Flow </w:t>
+      </w:r>
+      <w:r>
+        <w:t>Diagram</w:t>
+      </w:r>
+    </w:p>
+    <w:p>
+      <w:pPr>
+        <w:rPr>
+          <w:lang w:val="uk-UA"/>
+        </w:rPr>
+      </w:pPr>
+      <w:r>
+        <w:rPr>
+          <w:noProof/>
+        </w:rPr>
+        <w:drawing>
+          <wp:inline distT="0" distB="0" distL="0" distR="0" wp14:anchorId="01B523DE" wp14:editId="51944529">
+            <wp:extent cx="5791738" cy="7778115"/>
+            <wp:effectExtent l="0" t="0" r="0" b="0"/>
+            <wp:docPr id="130910264" name="Picture 5"/>
+            <wp:cNvGraphicFramePr>
+              <a:graphicFrameLocks xmlns:a="http://schemas.openxmlformats.org/drawingml/2006/main" noChangeAspect="1"/>
+            </wp:cNvGraphicFramePr>
+            <a:graphic xmlns:a="http://schemas.openxmlformats.org/drawingml/2006/main">
+              <a:graphicData uri="http://schemas.openxmlformats.org/drawingml/2006/picture">
+                <pic:pic xmlns:pic="http://schemas.openxmlformats.org/drawingml/2006/picture">
+                  <pic:nvPicPr>
+                    <pic:cNvPr id="0" name="Picture 5"/>
+                    <pic:cNvPicPr>
+                      <a:picLocks noChangeAspect="1" noChangeArrowheads="1"/>
+                    </pic:cNvPicPr>
+                  </pic:nvPicPr>
+                  <pic:blipFill>
+                    <a:blip r:embed="rId8">
+                      <a:extLst>
+                        <a:ext uri="{28A0092B-C50C-407E-A947-70E740481C1C}">
+                          <a14:useLocalDpi xmlns:a14="http://schemas.microsoft.com/office/drawing/2010/main" val="0"/>
+                        </a:ext>
+                      </a:extLst>
+                    </a:blip>
+                    <a:srcRect/>
+                    <a:stretch>
+                      <a:fillRect/>
+                    </a:stretch>
+                  </pic:blipFill>
+                  <pic:spPr bwMode="auto">
+                    <a:xfrm>
+                      <a:off x="0" y="0"/>
+                      <a:ext cx="5795005" cy="7782503"/>
+                    </a:xfrm>
+                    <a:prstGeom prst="rect">
+                      <a:avLst/>
+                    </a:prstGeom>
+                    <a:noFill/>
+                    <a:ln>
+                      <a:noFill/>
+                    </a:ln>
+                  </pic:spPr>
+                </pic:pic>
+              </a:graphicData>
+            </a:graphic>
+          </wp:inline>
+        </w:drawing>
+      </w:r>
+    </w:p>
+    <w:p>
+      <w:pPr>
+        <w:pStyle w:val="Heading2"/>
+        <w:rPr>
+          <w:lang w:val="uk-UA"/>
+        </w:rPr>
+      </w:pPr>
+      <w:r>
+        <w:rPr>
+          <w:lang w:val="uk-UA"/>
+        </w:rPr>
+        <w:lastRenderedPageBreak/>
+        <w:t>2</w:t>
+      </w:r>
+      <w:r>
+        <w:rPr>
+          <w:lang w:val="uk-UA"/>
+        </w:rPr>
+        <w:t>.3 Universal Links (iOS) &amp; App Links (Android)</w:t>
+      </w:r>
+    </w:p>
+    <w:p>
+      <w:pPr>
+        <w:rPr>
+          <w:sz w:val="24"/>
+          <w:szCs w:val="24"/>
+          <w:lang w:val="uk-UA"/>
+        </w:rPr>
+      </w:pPr>
+      <w:r>
+        <w:rPr>
+          <w:sz w:val="24"/>
+          <w:szCs w:val="24"/>
+          <w:lang w:val="uk-UA"/>
+        </w:rPr>
+        <w:t xml:space="preserve">This technical specification defines the implementation of Universal Links (iOS) and App Links (Android). </w:t>
+      </w:r>
+      <w:r>
+        <w:rPr>
+          <w:sz w:val="24"/>
+          <w:szCs w:val="24"/>
+        </w:rPr>
+        <w:t>T</w:t>
+      </w:r>
+      <w:r>
+        <w:rPr>
+          <w:sz w:val="24"/>
+          <w:szCs w:val="24"/>
+          <w:lang w:val="uk-UA"/>
+        </w:rPr>
+        <w:t>hese</w:t>
+      </w:r>
+      <w:r>
+        <w:rPr>
+          <w:sz w:val="24"/>
+          <w:szCs w:val="24"/>
+        </w:rPr>
+        <w:t xml:space="preserve"> </w:t>
+      </w:r>
+      <w:r>
+        <w:rPr>
+          <w:sz w:val="24"/>
+          <w:szCs w:val="24"/>
+          <w:lang w:val="uk-UA"/>
+        </w:rPr>
+        <w:t>are OS-level standards that use verified domain ownership to route users directly to the native application without leaving the current context.</w:t>
+      </w:r>
+    </w:p>
+    <w:p>
+      <w:pPr>
+        <w:rPr>
+          <w:sz w:val="24"/>
+          <w:szCs w:val="24"/>
+          <w:lang w:val="uk-UA"/>
+        </w:rPr>
+      </w:pPr>
+      <w:r>
         <w:rPr>
           <w:b/>
           <w:bCs/>
-        </w:rPr>
-      </w:pPr>
+          <w:sz w:val="24"/>
+          <w:szCs w:val="24"/>
+          <w:lang w:val="uk-UA"/>
+        </w:rPr>
+        <w:t>1. Overview</w:t>
+      </w:r>
+      <w:r>
+        <w:rPr>
+          <w:sz w:val="24"/>
+          <w:szCs w:val="24"/>
+          <w:lang w:val="uk-UA"/>
+        </w:rPr>
+        <w:t> Universal Links (iOS) and App Links (Android) allow a standard HTTPS URL (e.g., https://yourgame.com/join?</w:t>
+      </w:r>
+      <w:r>
+        <w:rPr>
+          <w:b/>
+          <w:bCs/>
+          <w:sz w:val="24"/>
+          <w:szCs w:val="24"/>
+        </w:rPr>
+        <w:t>roomId</w:t>
+      </w:r>
+      <w:r>
+        <w:rPr>
+          <w:sz w:val="24"/>
+          <w:szCs w:val="24"/>
+          <w:lang w:val="uk-UA"/>
+        </w:rPr>
+        <w:t>=123) to act as a direct entry point to a native app. If the app is installed, the OS intercepts the URL and launches the app. If the app is missing, the OS falls back to the mobile browser, where the Deferred Deep Linking logic begins.</w:t>
+      </w:r>
+    </w:p>
+    <w:p>
+      <w:pPr>
+        <w:rPr>
+          <w:sz w:val="24"/>
+          <w:szCs w:val="24"/>
+          <w:lang w:val="uk-UA"/>
+        </w:rPr>
+      </w:pPr>
+      <w:r>
+        <w:rPr>
+          <w:b/>
+          <w:bCs/>
+          <w:sz w:val="24"/>
+          <w:szCs w:val="24"/>
+          <w:lang w:val="uk-UA"/>
+        </w:rPr>
+        <w:t>2. Domain Verification (The "Handshake")</w:t>
+      </w:r>
+      <w:r>
+        <w:rPr>
+          <w:sz w:val="24"/>
+          <w:szCs w:val="24"/>
+          <w:lang w:val="uk-UA"/>
+        </w:rPr>
+        <w:t> For security, the OS must verify that the app developer owns the domain. This requires hosting specific JSON manifests in the /.well-known/ directory of your HTTPS server.</w:t>
+      </w:r>
+    </w:p>
+    <w:p>
+      <w:pPr>
+        <w:numPr>
+          <w:ilvl w:val="0"/>
+          <w:numId w:val="41"/>
+        </w:numPr>
+        <w:rPr>
+          <w:sz w:val="24"/>
+          <w:szCs w:val="24"/>
+          <w:lang w:val="uk-UA"/>
+        </w:rPr>
+      </w:pPr>
+      <w:r>
+        <w:rPr>
+          <w:b/>
+          <w:bCs/>
+          <w:sz w:val="24"/>
+          <w:szCs w:val="24"/>
+          <w:lang w:val="uk-UA"/>
+        </w:rPr>
+        <w:t>A. iOS: </w:t>
+      </w:r>
+      <w:r>
+        <w:rPr>
+          <w:b/>
+          <w:bCs/>
+          <w:i/>
+          <w:iCs/>
+          <w:sz w:val="24"/>
+          <w:szCs w:val="24"/>
+          <w:lang w:val="uk-UA"/>
+        </w:rPr>
+        <w:t>apple-app-site-association</w:t>
+      </w:r>
+      <w:r>
+        <w:rPr>
+          <w:b/>
+          <w:bCs/>
+          <w:sz w:val="24"/>
+          <w:szCs w:val="24"/>
+          <w:lang w:val="uk-UA"/>
+        </w:rPr>
+        <w:t> (AASA)</w:t>
+      </w:r>
+    </w:p>
+    <w:p>
+      <w:pPr>
+        <w:numPr>
+          <w:ilvl w:val="1"/>
+          <w:numId w:val="41"/>
+        </w:numPr>
+        <w:rPr>
+          <w:sz w:val="24"/>
+          <w:szCs w:val="24"/>
+          <w:lang w:val="uk-UA"/>
+        </w:rPr>
+      </w:pPr>
+      <w:r>
+        <w:rPr>
+          <w:sz w:val="24"/>
+          <w:szCs w:val="24"/>
+          <w:lang w:val="uk-UA"/>
+        </w:rPr>
+        <w:t>File Name: </w:t>
+      </w:r>
+      <w:r>
+        <w:rPr>
+          <w:i/>
+          <w:iCs/>
+          <w:sz w:val="24"/>
+          <w:szCs w:val="24"/>
+          <w:lang w:val="uk-UA"/>
+        </w:rPr>
+        <w:t>apple-app-site-association</w:t>
+      </w:r>
+      <w:r>
+        <w:rPr>
+          <w:sz w:val="24"/>
+          <w:szCs w:val="24"/>
+          <w:lang w:val="uk-UA"/>
+        </w:rPr>
+        <w:t> (No extension).</w:t>
+      </w:r>
+    </w:p>
+    <w:p>
+      <w:pPr>
+        <w:numPr>
+          <w:ilvl w:val="1"/>
+          <w:numId w:val="41"/>
+        </w:numPr>
+        <w:rPr>
+          <w:sz w:val="24"/>
+          <w:szCs w:val="24"/>
+          <w:lang w:val="uk-UA"/>
+        </w:rPr>
+      </w:pPr>
+      <w:r>
+        <w:rPr>
+          <w:sz w:val="24"/>
+          <w:szCs w:val="24"/>
+          <w:lang w:val="uk-UA"/>
+        </w:rPr>
+        <w:t>MIME Type: application/json.</w:t>
+      </w:r>
+    </w:p>
+    <w:p>
+      <w:pPr>
+        <w:numPr>
+          <w:ilvl w:val="1"/>
+          <w:numId w:val="41"/>
+        </w:numPr>
+        <w:rPr>
+          <w:sz w:val="24"/>
+          <w:szCs w:val="24"/>
+          <w:lang w:val="uk-UA"/>
+        </w:rPr>
+      </w:pPr>
+      <w:r>
+        <w:rPr>
+          <w:sz w:val="24"/>
+          <w:szCs w:val="24"/>
+          <w:lang w:val="uk-UA"/>
+        </w:rPr>
+        <w:t>Key Requirement: Must contain the appID (TeamID.BundleID) and the paths the app is authorized to handle.</w:t>
+      </w:r>
+    </w:p>
+    <w:p>
+      <w:pPr>
+        <w:numPr>
+          <w:ilvl w:val="0"/>
+          <w:numId w:val="41"/>
+        </w:numPr>
+        <w:rPr>
+          <w:sz w:val="24"/>
+          <w:szCs w:val="24"/>
+          <w:lang w:val="uk-UA"/>
+        </w:rPr>
+      </w:pPr>
+      <w:r>
+        <w:rPr>
+          <w:b/>
+          <w:bCs/>
+          <w:sz w:val="24"/>
+          <w:szCs w:val="24"/>
+          <w:lang w:val="uk-UA"/>
+        </w:rPr>
+        <w:t>B. Android: assetlinks.json</w:t>
+      </w:r>
+    </w:p>
+    <w:p>
+      <w:pPr>
+        <w:numPr>
+          <w:ilvl w:val="1"/>
+          <w:numId w:val="41"/>
+        </w:numPr>
+        <w:rPr>
+          <w:sz w:val="24"/>
+          <w:szCs w:val="24"/>
+          <w:lang w:val="uk-UA"/>
+        </w:rPr>
+      </w:pPr>
+      <w:r>
+        <w:rPr>
+          <w:sz w:val="24"/>
+          <w:szCs w:val="24"/>
+          <w:lang w:val="uk-UA"/>
+        </w:rPr>
+        <w:t>File Name: </w:t>
+      </w:r>
+      <w:r>
+        <w:rPr>
+          <w:i/>
+          <w:iCs/>
+          <w:sz w:val="24"/>
+          <w:szCs w:val="24"/>
+          <w:lang w:val="uk-UA"/>
+        </w:rPr>
+        <w:t>assetlinks.json</w:t>
+      </w:r>
+      <w:r>
+        <w:rPr>
+          <w:sz w:val="24"/>
+          <w:szCs w:val="24"/>
+          <w:lang w:val="uk-UA"/>
+        </w:rPr>
+        <w:t>.</w:t>
+      </w:r>
+    </w:p>
+    <w:p>
+      <w:pPr>
+        <w:numPr>
+          <w:ilvl w:val="1"/>
+          <w:numId w:val="41"/>
+        </w:numPr>
+        <w:rPr>
+          <w:sz w:val="24"/>
+          <w:szCs w:val="24"/>
+          <w:lang w:val="uk-UA"/>
+        </w:rPr>
+      </w:pPr>
+      <w:r>
+        <w:rPr>
+          <w:sz w:val="24"/>
+          <w:szCs w:val="24"/>
+          <w:lang w:val="uk-UA"/>
+        </w:rPr>
+        <w:t>MIME Type: application/json.</w:t>
+      </w:r>
+    </w:p>
+    <w:p>
+      <w:pPr>
+        <w:numPr>
+          <w:ilvl w:val="1"/>
+          <w:numId w:val="41"/>
+        </w:numPr>
+        <w:rPr>
+          <w:sz w:val="24"/>
+          <w:szCs w:val="24"/>
+          <w:lang w:val="uk-UA"/>
+        </w:rPr>
+      </w:pPr>
+      <w:r>
+        <w:rPr>
+          <w:sz w:val="24"/>
+          <w:szCs w:val="24"/>
+          <w:lang w:val="uk-UA"/>
+        </w:rPr>
+        <w:t>Key Requirement: Must contain the package_name and the sha256_cert_fingerprints of your app’s signing certificate.</w:t>
+      </w:r>
+    </w:p>
+    <w:p>
+      <w:pPr>
+        <w:rPr>
+          <w:sz w:val="24"/>
+          <w:szCs w:val="24"/>
+          <w:lang w:val="uk-UA"/>
+        </w:rPr>
+      </w:pPr>
+      <w:r>
+        <w:rPr>
+          <w:b/>
+          <w:bCs/>
+          <w:sz w:val="24"/>
+          <w:szCs w:val="24"/>
+          <w:lang w:val="uk-UA"/>
+        </w:rPr>
+        <w:t>3. Technical Execution Flow</w:t>
+      </w:r>
+    </w:p>
+    <w:p>
+      <w:pPr>
+        <w:numPr>
+          <w:ilvl w:val="0"/>
+          <w:numId w:val="42"/>
+        </w:numPr>
+        <w:rPr>
+          <w:sz w:val="24"/>
+          <w:szCs w:val="24"/>
+          <w:lang w:val="uk-UA"/>
+        </w:rPr>
+      </w:pPr>
+      <w:r>
+        <w:rPr>
+          <w:b/>
+          <w:bCs/>
+          <w:sz w:val="24"/>
+          <w:szCs w:val="24"/>
+          <w:lang w:val="uk-UA"/>
+        </w:rPr>
+        <w:t>System Interception:</w:t>
+      </w:r>
+      <w:r>
+        <w:rPr>
+          <w:sz w:val="24"/>
+          <w:szCs w:val="24"/>
+          <w:lang w:val="uk-UA"/>
+        </w:rPr>
+        <w:t> The user scans a QR code containing an HTTPS URL. The OS checks its internal database for verified domain associations.</w:t>
+      </w:r>
+    </w:p>
+    <w:p>
+      <w:pPr>
+        <w:numPr>
+          <w:ilvl w:val="0"/>
+          <w:numId w:val="42"/>
+        </w:numPr>
+        <w:rPr>
+          <w:sz w:val="24"/>
+          <w:szCs w:val="24"/>
+          <w:lang w:val="uk-UA"/>
+        </w:rPr>
+      </w:pPr>
+      <w:r>
+        <w:rPr>
+          <w:b/>
+          <w:bCs/>
+          <w:sz w:val="24"/>
+          <w:szCs w:val="24"/>
+          <w:lang w:val="uk-UA"/>
+        </w:rPr>
+        <w:t>App Installed Path:</w:t>
+      </w:r>
+    </w:p>
+    <w:p>
+      <w:pPr>
+        <w:numPr>
+          <w:ilvl w:val="1"/>
+          <w:numId w:val="42"/>
+        </w:numPr>
+        <w:rPr>
+          <w:sz w:val="24"/>
+          <w:szCs w:val="24"/>
+          <w:lang w:val="uk-UA"/>
+        </w:rPr>
+      </w:pPr>
+      <w:r>
+        <w:rPr>
+          <w:sz w:val="24"/>
+          <w:szCs w:val="24"/>
+          <w:lang w:val="uk-UA"/>
+        </w:rPr>
+        <w:t>The OS launches the app immediately.</w:t>
+      </w:r>
+    </w:p>
+    <w:p>
+      <w:pPr>
+        <w:numPr>
+          <w:ilvl w:val="1"/>
+          <w:numId w:val="42"/>
+        </w:numPr>
+        <w:rPr>
+          <w:sz w:val="24"/>
+          <w:szCs w:val="24"/>
+          <w:lang w:val="uk-UA"/>
+        </w:rPr>
+      </w:pPr>
+      <w:r>
+        <w:rPr>
+          <w:sz w:val="24"/>
+          <w:szCs w:val="24"/>
+          <w:lang w:val="uk-UA"/>
+        </w:rPr>
+        <w:t>The app receives the URL via userActivity (iOS) or Intent (Android).</w:t>
+      </w:r>
+    </w:p>
+    <w:p>
+      <w:pPr>
+        <w:numPr>
+          <w:ilvl w:val="1"/>
+          <w:numId w:val="42"/>
+        </w:numPr>
+        <w:rPr>
+          <w:sz w:val="24"/>
+          <w:szCs w:val="24"/>
+          <w:lang w:val="uk-UA"/>
+        </w:rPr>
+      </w:pPr>
+      <w:r>
+        <w:rPr>
+          <w:sz w:val="24"/>
+          <w:szCs w:val="24"/>
+          <w:lang w:val="uk-UA"/>
+        </w:rPr>
+        <w:t>The app parses </w:t>
+      </w:r>
+      <w:r>
+        <w:rPr>
+          <w:b/>
+          <w:bCs/>
+          <w:i/>
+          <w:iCs/>
+          <w:sz w:val="24"/>
+          <w:szCs w:val="24"/>
+        </w:rPr>
+        <w:t>roomId</w:t>
+      </w:r>
+      <w:r>
+        <w:rPr>
+          <w:sz w:val="24"/>
+          <w:szCs w:val="24"/>
+          <w:lang w:val="uk-UA"/>
+        </w:rPr>
+        <w:t xml:space="preserve"> =123 and connects to the game.</w:t>
+      </w:r>
+    </w:p>
+    <w:p>
+      <w:pPr>
+        <w:numPr>
+          <w:ilvl w:val="0"/>
+          <w:numId w:val="42"/>
+        </w:numPr>
+        <w:rPr>
+          <w:sz w:val="24"/>
+          <w:szCs w:val="24"/>
+          <w:lang w:val="uk-UA"/>
+        </w:rPr>
+      </w:pPr>
+      <w:r>
+        <w:rPr>
+          <w:b/>
+          <w:bCs/>
+          <w:sz w:val="24"/>
+          <w:szCs w:val="24"/>
+          <w:lang w:val="uk-UA"/>
+        </w:rPr>
+        <w:t>App Missing Path (Fallback to Deferred):</w:t>
+      </w:r>
+    </w:p>
+    <w:p>
+      <w:pPr>
+        <w:numPr>
+          <w:ilvl w:val="1"/>
+          <w:numId w:val="42"/>
+        </w:numPr>
+        <w:rPr>
+          <w:sz w:val="24"/>
+          <w:szCs w:val="24"/>
+          <w:lang w:val="uk-UA"/>
+        </w:rPr>
+      </w:pPr>
+      <w:r>
+        <w:rPr>
+          <w:sz w:val="24"/>
+          <w:szCs w:val="24"/>
+          <w:lang w:val="uk-UA"/>
+        </w:rPr>
+        <w:t>The OS opens the URL in the mobile browser.</w:t>
+      </w:r>
+    </w:p>
+    <w:p>
+      <w:pPr>
+        <w:numPr>
+          <w:ilvl w:val="1"/>
+          <w:numId w:val="42"/>
+        </w:numPr>
+        <w:rPr>
+          <w:sz w:val="24"/>
+          <w:szCs w:val="24"/>
+          <w:lang w:val="uk-UA"/>
+        </w:rPr>
+      </w:pPr>
+      <w:r>
+        <w:rPr>
+          <w:sz w:val="24"/>
+          <w:szCs w:val="24"/>
+          <w:lang w:val="uk-UA"/>
+        </w:rPr>
+        <w:lastRenderedPageBreak/>
+        <w:t>The Redirector page loads and captures Fingerprint FP1.</w:t>
+      </w:r>
+    </w:p>
+    <w:p>
+      <w:pPr>
+        <w:numPr>
+          <w:ilvl w:val="1"/>
+          <w:numId w:val="42"/>
+        </w:numPr>
+        <w:rPr>
+          <w:sz w:val="24"/>
+          <w:szCs w:val="24"/>
+          <w:lang w:val="uk-UA"/>
+        </w:rPr>
+      </w:pPr>
+      <w:r>
+        <w:rPr>
+          <w:sz w:val="24"/>
+          <w:szCs w:val="24"/>
+          <w:lang w:val="uk-UA"/>
+        </w:rPr>
+        <w:t>The server saves the context with a 30-minute TTL.</w:t>
+      </w:r>
+    </w:p>
+    <w:p>
+      <w:pPr>
+        <w:numPr>
+          <w:ilvl w:val="1"/>
+          <w:numId w:val="42"/>
+        </w:numPr>
+        <w:rPr>
+          <w:sz w:val="24"/>
+          <w:szCs w:val="24"/>
+          <w:lang w:val="uk-UA"/>
+        </w:rPr>
+      </w:pPr>
+      <w:r>
+        <w:rPr>
+          <w:sz w:val="24"/>
+          <w:szCs w:val="24"/>
+          <w:lang w:val="uk-UA"/>
+        </w:rPr>
+        <w:t>The user is redirected to the App Store.</w:t>
+      </w:r>
+    </w:p>
+    <w:p>
+      <w:pPr>
+        <w:numPr>
+          <w:ilvl w:val="1"/>
+          <w:numId w:val="42"/>
+        </w:numPr>
+        <w:rPr>
+          <w:sz w:val="24"/>
+          <w:szCs w:val="24"/>
+          <w:lang w:val="uk-UA"/>
+        </w:rPr>
+      </w:pPr>
+      <w:r>
+        <w:rPr>
+          <w:sz w:val="24"/>
+          <w:szCs w:val="24"/>
+          <w:lang w:val="uk-UA"/>
+        </w:rPr>
+        <w:t>Upon first launch, the app uses Fingerprint FP2 to retrieve the lost roomID from the server.</w:t>
+      </w:r>
+    </w:p>
+    <w:p>
+      <w:pPr>
+        <w:rPr>
+          <w:sz w:val="24"/>
+          <w:szCs w:val="24"/>
+          <w:lang w:val="uk-UA"/>
+        </w:rPr>
+      </w:pPr>
+      <w:r>
+        <w:rPr>
+          <w:b/>
+          <w:bCs/>
+          <w:sz w:val="24"/>
+          <w:szCs w:val="24"/>
+          <w:lang w:val="uk-UA"/>
+        </w:rPr>
+        <w:t>4. Implementation Notes</w:t>
+      </w:r>
+    </w:p>
+    <w:p>
+      <w:pPr>
+        <w:numPr>
+          <w:ilvl w:val="0"/>
+          <w:numId w:val="43"/>
+        </w:numPr>
+        <w:rPr>
+          <w:sz w:val="24"/>
+          <w:szCs w:val="24"/>
+          <w:lang w:val="uk-UA"/>
+        </w:rPr>
+      </w:pPr>
+      <w:r>
+        <w:rPr>
+          <w:b/>
+          <w:bCs/>
+          <w:sz w:val="24"/>
+          <w:szCs w:val="24"/>
+          <w:lang w:val="uk-UA"/>
+        </w:rPr>
+        <w:t>Verification Latency:</w:t>
+      </w:r>
+      <w:r>
+        <w:rPr>
+          <w:sz w:val="24"/>
+          <w:szCs w:val="24"/>
+          <w:lang w:val="uk-UA"/>
+        </w:rPr>
+        <w:t> Apple's CDN caches AASA files. Changes may take up to 24 hours to propagate across all devices.</w:t>
+      </w:r>
+    </w:p>
+    <w:p>
+      <w:pPr>
+        <w:numPr>
+          <w:ilvl w:val="0"/>
+          <w:numId w:val="43"/>
+        </w:numPr>
+        <w:rPr>
+          <w:sz w:val="24"/>
+          <w:szCs w:val="24"/>
+          <w:lang w:val="uk-UA"/>
+        </w:rPr>
+      </w:pPr>
+      <w:r>
+        <w:rPr>
+          <w:b/>
+          <w:bCs/>
+          <w:sz w:val="24"/>
+          <w:szCs w:val="24"/>
+          <w:lang w:val="uk-UA"/>
+        </w:rPr>
+        <w:t>HTTPS Only:</w:t>
+      </w:r>
+      <w:r>
+        <w:rPr>
+          <w:sz w:val="24"/>
+          <w:szCs w:val="24"/>
+          <w:lang w:val="uk-UA"/>
+        </w:rPr>
+        <w:t> Both iOS and Android strictly require a valid SSL certificate for domain verification.</w:t>
+      </w:r>
+    </w:p>
+    <w:p>
+      <w:pPr>
+        <w:numPr>
+          <w:ilvl w:val="0"/>
+          <w:numId w:val="43"/>
+        </w:numPr>
+        <w:rPr>
+          <w:sz w:val="24"/>
+          <w:szCs w:val="24"/>
+          <w:lang w:val="uk-UA"/>
+        </w:rPr>
+      </w:pPr>
+      <w:r>
+        <w:rPr>
+          <w:b/>
+          <w:bCs/>
+          <w:sz w:val="24"/>
+          <w:szCs w:val="24"/>
+          <w:lang w:val="uk-UA"/>
+        </w:rPr>
+        <w:t>Partial Failure:</w:t>
+      </w:r>
+      <w:r>
+        <w:rPr>
+          <w:sz w:val="24"/>
+          <w:szCs w:val="24"/>
+          <w:lang w:val="uk-UA"/>
+        </w:rPr>
+        <w:t> If verification fails for any reason, the OS will default to the browser, making your Deferred Deep Linking infrastructure a mandatory backup.</w:t>
+      </w:r>
+    </w:p>
+    <w:p>
+      <w:pPr>
+        <w:ind w:left="360"/>
+        <w:rPr>
+          <w:b/>
+          <w:bCs/>
+          <w:sz w:val="24"/>
+          <w:szCs w:val="24"/>
+        </w:rPr>
+      </w:pPr>
+      <w:r>
+        <w:rPr>
+          <w:b/>
+          <w:bCs/>
+          <w:sz w:val="24"/>
+          <w:szCs w:val="24"/>
+        </w:rPr>
+        <w:t>Flow diagram of the method.</w:t>
+      </w:r>
+    </w:p>
+    <w:p>
+      <w:pPr>
+        <w:ind w:left="360"/>
+        <w:rPr>
+          <w:sz w:val="24"/>
+          <w:szCs w:val="24"/>
+        </w:rPr>
+      </w:pPr>
+      <w:r>
+        <w:rPr>
+          <w:i/>
+          <w:iCs/>
+          <w:noProof/>
+        </w:rPr>
+        <w:drawing>
+          <wp:inline distT="0" distB="0" distL="0" distR="0" wp14:anchorId="7C2B94E9" wp14:editId="39821B1E">
+            <wp:extent cx="5943600" cy="4420109"/>
+            <wp:effectExtent l="0" t="0" r="0" b="0"/>
+            <wp:docPr id="1820189908" name="Picture 5"/>
+            <wp:cNvGraphicFramePr>
+              <a:graphicFrameLocks xmlns:a="http://schemas.openxmlformats.org/drawingml/2006/main" noChangeAspect="1"/>
+            </wp:cNvGraphicFramePr>
+            <a:graphic xmlns:a="http://schemas.openxmlformats.org/drawingml/2006/main">
+              <a:graphicData uri="http://schemas.openxmlformats.org/drawingml/2006/picture">
+                <pic:pic xmlns:pic="http://schemas.openxmlformats.org/drawingml/2006/picture">
+                  <pic:nvPicPr>
+                    <pic:cNvPr id="0" name="Picture 5"/>
+                    <pic:cNvPicPr>
+                      <a:picLocks noChangeAspect="1" noChangeArrowheads="1"/>
+                    </pic:cNvPicPr>
+                  </pic:nvPicPr>
+                  <pic:blipFill>
+                    <a:blip r:embed="rId9" cstate="print">
+                      <a:extLst>
+                        <a:ext uri="{28A0092B-C50C-407E-A947-70E740481C1C}">
+                          <a14:useLocalDpi xmlns:a14="http://schemas.microsoft.com/office/drawing/2010/main" val="0"/>
+                        </a:ext>
+                      </a:extLst>
+                    </a:blip>
+                    <a:srcRect/>
+                    <a:stretch>
+                      <a:fillRect/>
+                    </a:stretch>
+                  </pic:blipFill>
+                  <pic:spPr bwMode="auto">
+                    <a:xfrm>
+                      <a:off x="0" y="0"/>
+                      <a:ext cx="5943600" cy="4420109"/>
+                    </a:xfrm>
+                    <a:prstGeom prst="rect">
+                      <a:avLst/>
+                    </a:prstGeom>
+                    <a:noFill/>
+                    <a:ln>
+                      <a:noFill/>
+                    </a:ln>
+                  </pic:spPr>
+                </pic:pic>
+              </a:graphicData>
+            </a:graphic>
+          </wp:inline>
+        </w:drawing>
+      </w:r>
     </w:p>
     <w:p>
       <w:pPr>
         <w:pStyle w:val="Heading1"/>
-        <w:rPr>
-          <w:lang w:val="uk-UA"/>
-        </w:rPr>
-      </w:pPr>
-      <w:r>
-        <w:rPr>
-          <w:lang w:val="uk-UA"/>
-        </w:rPr>
-        <w:t>2. System Architecture</w:t>
-      </w:r>
-    </w:p>
-    <w:p>
-      <w:pPr>
-        <w:rPr>
-          <w:sz w:val="24"/>
-          <w:szCs w:val="24"/>
-        </w:rPr>
-      </w:pPr>
-      <w:r>
-        <w:rPr>
-          <w:sz w:val="24"/>
-          <w:szCs w:val="24"/>
-          <w:lang w:val="uk-UA"/>
-        </w:rPr>
-        <w:t>This section outlines the React Native component architecture and core modules that drive the client application.</w:t>
+      </w:pPr>
+      <w:r>
+        <w:lastRenderedPageBreak/>
+        <w:t>3</w:t>
+      </w:r>
+      <w:r>
+        <w:rPr>
+          <w:lang w:val="uk-UA"/>
+        </w:rPr>
+        <w:t>. System Architecture</w:t>
+      </w:r>
+    </w:p>
+    <w:p>
+      <w:pPr>
+        <w:rPr>
+          <w:sz w:val="24"/>
+          <w:szCs w:val="24"/>
+        </w:rPr>
+      </w:pPr>
+      <w:r>
+        <w:rPr>
+          <w:sz w:val="24"/>
+          <w:szCs w:val="24"/>
+        </w:rPr>
+        <w:t xml:space="preserve">To implement the </w:t>
+      </w:r>
+      <w:r>
+        <w:rPr>
+          <w:sz w:val="24"/>
+          <w:szCs w:val="24"/>
+        </w:rPr>
+        <w:t>above-mentioned</w:t>
+      </w:r>
+      <w:r>
+        <w:rPr>
+          <w:sz w:val="24"/>
+          <w:szCs w:val="24"/>
+        </w:rPr>
+        <w:t xml:space="preserve"> flow t</w:t>
+      </w:r>
+      <w:r>
+        <w:rPr>
+          <w:sz w:val="24"/>
+          <w:szCs w:val="24"/>
+          <w:lang w:val="uk-UA"/>
+        </w:rPr>
+        <w:t>his section outlines the React Native component architecture and core modules that drive the client application.</w:t>
       </w:r>
     </w:p>
     <w:p>
@@ -359,7 +1405,7 @@
                     </pic:cNvPicPr>
                   </pic:nvPicPr>
                   <pic:blipFill>
-                    <a:blip r:embed="rId7" cstate="print">
+                    <a:blip r:embed="rId10" cstate="print">
                       <a:extLst>
                         <a:ext uri="{28A0092B-C50C-407E-A947-70E740481C1C}">
                           <a14:useLocalDpi xmlns:a14="http://schemas.microsoft.com/office/drawing/2010/main" val="0"/>
@@ -399,10 +1445,13 @@
         </w:rPr>
       </w:pPr>
       <w:r>
-        <w:rPr>
-          <w:lang w:val="uk-UA"/>
-        </w:rPr>
-        <w:t>2.1 Core Components</w:t>
+        <w:t>3</w:t>
+      </w:r>
+      <w:r>
+        <w:rPr>
+          <w:lang w:val="uk-UA"/>
+        </w:rPr>
+        <w:t>.1 Core Components</w:t>
       </w:r>
     </w:p>
     <w:p>
@@ -436,7 +1485,6 @@
           <w:bCs/>
           <w:lang w:val="uk-UA"/>
         </w:rPr>
-        <w:lastRenderedPageBreak/>
         <w:t>App.tsx - Application Bootstrap &amp; Global State</w:t>
       </w:r>
     </w:p>
@@ -556,6 +1604,7 @@
           <w:bCs/>
           <w:lang w:val="uk-UA"/>
         </w:rPr>
+        <w:lastRenderedPageBreak/>
         <w:t>NetworkProvider (Context) - Network Communication Layer</w:t>
       </w:r>
     </w:p>
@@ -932,7 +1981,6 @@
           <w:bCs/>
           <w:lang w:val="uk-UA"/>
         </w:rPr>
-        <w:lastRenderedPageBreak/>
         <w:t>InputGuard.tsx - Interaction Control Overlay</w:t>
       </w:r>
     </w:p>
@@ -1015,6 +2063,7 @@
           <w:bCs/>
           <w:lang w:val="uk-UA"/>
         </w:rPr>
+        <w:lastRenderedPageBreak/>
         <w:t>Container.tsx</w:t>
       </w:r>
       <w:r>
@@ -1323,1838 +2372,6 @@
         <w:br w:type="page"/>
       </w:r>
     </w:p>
-    <w:p>
-      <w:pPr>
-        <w:pStyle w:val="Heading1"/>
-        <w:rPr>
-          <w:lang w:val="uk-UA"/>
-        </w:rPr>
-      </w:pPr>
-      <w:r>
-        <w:rPr>
-          <w:lang w:val="uk-UA"/>
-        </w:rPr>
-        <w:lastRenderedPageBreak/>
-        <w:t xml:space="preserve">3. </w:t>
-      </w:r>
-      <w:r>
-        <w:t>User Flows &amp; Deep Linking Methods</w:t>
-      </w:r>
-    </w:p>
-    <w:p>
-      <w:pPr>
-        <w:rPr>
-          <w:sz w:val="24"/>
-          <w:szCs w:val="24"/>
-          <w:lang w:val="uk-UA"/>
-        </w:rPr>
-      </w:pPr>
-      <w:r>
-        <w:rPr>
-          <w:sz w:val="24"/>
-          <w:szCs w:val="24"/>
-          <w:lang w:val="uk-UA"/>
-        </w:rPr>
-        <w:t>This section defines the entry points into the application, mapping out the connection flow from a physical touchpoint (QR code) to active gameplay.</w:t>
-      </w:r>
-    </w:p>
-    <w:p>
-      <w:pPr>
-        <w:pStyle w:val="Heading2"/>
-        <w:rPr>
-          <w:lang w:val="uk-UA"/>
-        </w:rPr>
-      </w:pPr>
-      <w:r>
-        <w:rPr>
-          <w:lang w:val="uk-UA"/>
-        </w:rPr>
-        <w:t>3.1 Generic Flow Diagram</w:t>
-      </w:r>
-    </w:p>
-    <w:p>
-      <w:pPr>
-        <w:rPr>
-          <w:lang w:val="uk-UA"/>
-        </w:rPr>
-      </w:pPr>
-    </w:p>
-    <w:p>
-      <w:r>
-        <w:rPr>
-          <w:noProof/>
-        </w:rPr>
-        <w:drawing>
-          <wp:inline distT="0" distB="0" distL="0" distR="0" wp14:anchorId="2F6EA989" wp14:editId="0B97A970">
-            <wp:extent cx="6172220" cy="6496050"/>
-            <wp:effectExtent l="0" t="0" r="0" b="0"/>
-            <wp:docPr id="1280596360" name="Picture 2"/>
-            <wp:cNvGraphicFramePr>
-              <a:graphicFrameLocks xmlns:a="http://schemas.openxmlformats.org/drawingml/2006/main" noChangeAspect="1"/>
-            </wp:cNvGraphicFramePr>
-            <a:graphic xmlns:a="http://schemas.openxmlformats.org/drawingml/2006/main">
-              <a:graphicData uri="http://schemas.openxmlformats.org/drawingml/2006/picture">
-                <pic:pic xmlns:pic="http://schemas.openxmlformats.org/drawingml/2006/picture">
-                  <pic:nvPicPr>
-                    <pic:cNvPr id="0" name="Picture 2"/>
-                    <pic:cNvPicPr>
-                      <a:picLocks noChangeAspect="1" noChangeArrowheads="1"/>
-                    </pic:cNvPicPr>
-                  </pic:nvPicPr>
-                  <pic:blipFill>
-                    <a:blip r:embed="rId8">
-                      <a:extLst>
-                        <a:ext uri="{28A0092B-C50C-407E-A947-70E740481C1C}">
-                          <a14:useLocalDpi xmlns:a14="http://schemas.microsoft.com/office/drawing/2010/main" val="0"/>
-                        </a:ext>
-                      </a:extLst>
-                    </a:blip>
-                    <a:srcRect/>
-                    <a:stretch>
-                      <a:fillRect/>
-                    </a:stretch>
-                  </pic:blipFill>
-                  <pic:spPr bwMode="auto">
-                    <a:xfrm>
-                      <a:off x="0" y="0"/>
-                      <a:ext cx="6175767" cy="6499783"/>
-                    </a:xfrm>
-                    <a:prstGeom prst="rect">
-                      <a:avLst/>
-                    </a:prstGeom>
-                    <a:noFill/>
-                    <a:ln>
-                      <a:noFill/>
-                    </a:ln>
-                  </pic:spPr>
-                </pic:pic>
-              </a:graphicData>
-            </a:graphic>
-          </wp:inline>
-        </w:drawing>
-      </w:r>
-    </w:p>
-    <w:p>
-      <w:pPr>
-        <w:pStyle w:val="Heading2"/>
-      </w:pPr>
-      <w:r>
-        <w:rPr>
-          <w:lang w:val="uk-UA"/>
-        </w:rPr>
-        <w:lastRenderedPageBreak/>
-        <w:t>3.2 Detailed Flow Cases</w:t>
-      </w:r>
-    </w:p>
-    <w:p>
-      <w:pPr>
-        <w:pStyle w:val="Heading3"/>
-      </w:pPr>
-      <w:r>
-        <w:t>Case 1. Application Installed </w:t>
-      </w:r>
-    </w:p>
-    <w:p/>
-    <w:p>
-      <w:pPr>
-        <w:jc w:val="center"/>
-        <w:rPr>
-          <w:lang w:val="uk-UA"/>
-        </w:rPr>
-      </w:pPr>
-      <w:r>
-        <w:rPr>
-          <w:noProof/>
-          <w:lang w:val="uk-UA"/>
-        </w:rPr>
-        <w:drawing>
-          <wp:inline distT="0" distB="0" distL="0" distR="0" wp14:anchorId="696C8682" wp14:editId="448A73E5">
-            <wp:extent cx="4114800" cy="7269667"/>
-            <wp:effectExtent l="0" t="0" r="0" b="7620"/>
-            <wp:docPr id="101034752" name="Picture 2"/>
-            <wp:cNvGraphicFramePr>
-              <a:graphicFrameLocks xmlns:a="http://schemas.openxmlformats.org/drawingml/2006/main" noChangeAspect="1"/>
-            </wp:cNvGraphicFramePr>
-            <a:graphic xmlns:a="http://schemas.openxmlformats.org/drawingml/2006/main">
-              <a:graphicData uri="http://schemas.openxmlformats.org/drawingml/2006/picture">
-                <pic:pic xmlns:pic="http://schemas.openxmlformats.org/drawingml/2006/picture">
-                  <pic:nvPicPr>
-                    <pic:cNvPr id="0" name="Picture 2"/>
-                    <pic:cNvPicPr>
-                      <a:picLocks noChangeAspect="1" noChangeArrowheads="1"/>
-                    </pic:cNvPicPr>
-                  </pic:nvPicPr>
-                  <pic:blipFill>
-                    <a:blip r:embed="rId9">
-                      <a:extLst>
-                        <a:ext uri="{28A0092B-C50C-407E-A947-70E740481C1C}">
-                          <a14:useLocalDpi xmlns:a14="http://schemas.microsoft.com/office/drawing/2010/main" val="0"/>
-                        </a:ext>
-                      </a:extLst>
-                    </a:blip>
-                    <a:srcRect/>
-                    <a:stretch>
-                      <a:fillRect/>
-                    </a:stretch>
-                  </pic:blipFill>
-                  <pic:spPr bwMode="auto">
-                    <a:xfrm>
-                      <a:off x="0" y="0"/>
-                      <a:ext cx="4121120" cy="7280833"/>
-                    </a:xfrm>
-                    <a:prstGeom prst="rect">
-                      <a:avLst/>
-                    </a:prstGeom>
-                    <a:noFill/>
-                    <a:ln>
-                      <a:noFill/>
-                    </a:ln>
-                  </pic:spPr>
-                </pic:pic>
-              </a:graphicData>
-            </a:graphic>
-          </wp:inline>
-        </w:drawing>
-      </w:r>
-      <w:r>
-        <w:rPr>
-          <w:noProof/>
-        </w:rPr>
-        <w:br w:type="page"/>
-      </w:r>
-    </w:p>
-    <w:p>
-      <w:pPr>
-        <w:pStyle w:val="Heading3"/>
-      </w:pPr>
-      <w:r>
-        <w:lastRenderedPageBreak/>
-        <w:t>Case 2. Application Not Installed</w:t>
-      </w:r>
-    </w:p>
-    <w:p/>
-    <w:p>
-      <w:pPr>
-        <w:jc w:val="center"/>
-      </w:pPr>
-      <w:r>
-        <w:rPr>
-          <w:noProof/>
-        </w:rPr>
-        <w:drawing>
-          <wp:inline distT="0" distB="0" distL="0" distR="0" wp14:anchorId="0DA7E6E6" wp14:editId="11C4E267">
-            <wp:extent cx="5175250" cy="6983270"/>
-            <wp:effectExtent l="0" t="0" r="6350" b="8255"/>
-            <wp:docPr id="2005376459" name="Picture 3"/>
-            <wp:cNvGraphicFramePr>
-              <a:graphicFrameLocks xmlns:a="http://schemas.openxmlformats.org/drawingml/2006/main" noChangeAspect="1"/>
-            </wp:cNvGraphicFramePr>
-            <a:graphic xmlns:a="http://schemas.openxmlformats.org/drawingml/2006/main">
-              <a:graphicData uri="http://schemas.openxmlformats.org/drawingml/2006/picture">
-                <pic:pic xmlns:pic="http://schemas.openxmlformats.org/drawingml/2006/picture">
-                  <pic:nvPicPr>
-                    <pic:cNvPr id="0" name="Picture 3"/>
-                    <pic:cNvPicPr>
-                      <a:picLocks noChangeAspect="1" noChangeArrowheads="1"/>
-                    </pic:cNvPicPr>
-                  </pic:nvPicPr>
-                  <pic:blipFill>
-                    <a:blip r:embed="rId10">
-                      <a:extLst>
-                        <a:ext uri="{28A0092B-C50C-407E-A947-70E740481C1C}">
-                          <a14:useLocalDpi xmlns:a14="http://schemas.microsoft.com/office/drawing/2010/main" val="0"/>
-                        </a:ext>
-                      </a:extLst>
-                    </a:blip>
-                    <a:srcRect/>
-                    <a:stretch>
-                      <a:fillRect/>
-                    </a:stretch>
-                  </pic:blipFill>
-                  <pic:spPr bwMode="auto">
-                    <a:xfrm>
-                      <a:off x="0" y="0"/>
-                      <a:ext cx="5179022" cy="6988360"/>
-                    </a:xfrm>
-                    <a:prstGeom prst="rect">
-                      <a:avLst/>
-                    </a:prstGeom>
-                    <a:noFill/>
-                    <a:ln>
-                      <a:noFill/>
-                    </a:ln>
-                  </pic:spPr>
-                </pic:pic>
-              </a:graphicData>
-            </a:graphic>
-          </wp:inline>
-        </w:drawing>
-      </w:r>
-    </w:p>
-    <w:p>
-      <w:pPr>
-        <w:pStyle w:val="Heading3"/>
-      </w:pPr>
-    </w:p>
-    <w:p/>
-    <w:p>
-      <w:pPr>
-        <w:pStyle w:val="Heading3"/>
-        <w:rPr>
-          <w:lang w:val="uk-UA"/>
-        </w:rPr>
-      </w:pPr>
-      <w:r>
-        <w:lastRenderedPageBreak/>
-        <w:t>Case 3. Application Launches First from the Mobile Device</w:t>
-      </w:r>
-    </w:p>
-    <w:p>
-      <w:pPr>
-        <w:jc w:val="center"/>
-      </w:pPr>
-      <w:r>
-        <w:rPr>
-          <w:noProof/>
-        </w:rPr>
-        <w:drawing>
-          <wp:inline distT="0" distB="0" distL="0" distR="0" wp14:anchorId="56DFD8FF" wp14:editId="55B5124C">
-            <wp:extent cx="3708400" cy="6875660"/>
-            <wp:effectExtent l="0" t="0" r="6350" b="1905"/>
-            <wp:docPr id="450886616" name="Picture 4"/>
-            <wp:cNvGraphicFramePr>
-              <a:graphicFrameLocks xmlns:a="http://schemas.openxmlformats.org/drawingml/2006/main" noChangeAspect="1"/>
-            </wp:cNvGraphicFramePr>
-            <a:graphic xmlns:a="http://schemas.openxmlformats.org/drawingml/2006/main">
-              <a:graphicData uri="http://schemas.openxmlformats.org/drawingml/2006/picture">
-                <pic:pic xmlns:pic="http://schemas.openxmlformats.org/drawingml/2006/picture">
-                  <pic:nvPicPr>
-                    <pic:cNvPr id="0" name="Picture 4"/>
-                    <pic:cNvPicPr>
-                      <a:picLocks noChangeAspect="1" noChangeArrowheads="1"/>
-                    </pic:cNvPicPr>
-                  </pic:nvPicPr>
-                  <pic:blipFill>
-                    <a:blip r:embed="rId11">
-                      <a:extLst>
-                        <a:ext uri="{28A0092B-C50C-407E-A947-70E740481C1C}">
-                          <a14:useLocalDpi xmlns:a14="http://schemas.microsoft.com/office/drawing/2010/main" val="0"/>
-                        </a:ext>
-                      </a:extLst>
-                    </a:blip>
-                    <a:srcRect/>
-                    <a:stretch>
-                      <a:fillRect/>
-                    </a:stretch>
-                  </pic:blipFill>
-                  <pic:spPr bwMode="auto">
-                    <a:xfrm>
-                      <a:off x="0" y="0"/>
-                      <a:ext cx="3710591" cy="6879722"/>
-                    </a:xfrm>
-                    <a:prstGeom prst="rect">
-                      <a:avLst/>
-                    </a:prstGeom>
-                    <a:noFill/>
-                    <a:ln>
-                      <a:noFill/>
-                    </a:ln>
-                  </pic:spPr>
-                </pic:pic>
-              </a:graphicData>
-            </a:graphic>
-          </wp:inline>
-        </w:drawing>
-      </w:r>
-    </w:p>
-    <w:p>
-      <w:pPr>
-        <w:jc w:val="center"/>
-      </w:pPr>
-    </w:p>
-    <w:p/>
-    <w:p>
-      <w:pPr>
-        <w:rPr>
-          <w:sz w:val="24"/>
-          <w:szCs w:val="24"/>
-        </w:rPr>
-      </w:pPr>
-    </w:p>
-    <w:p>
-      <w:pPr>
-        <w:pStyle w:val="Heading2"/>
-        <w:rPr>
-          <w:lang w:val="uk-UA"/>
-        </w:rPr>
-      </w:pPr>
-      <w:r>
-        <w:rPr>
-          <w:lang w:val="uk-UA"/>
-        </w:rPr>
-        <w:lastRenderedPageBreak/>
-        <w:t>3.3 Universal Links (iOS) &amp; App Links (Android)</w:t>
-      </w:r>
-    </w:p>
-    <w:p>
-      <w:pPr>
-        <w:rPr>
-          <w:sz w:val="24"/>
-          <w:szCs w:val="24"/>
-          <w:lang w:val="uk-UA"/>
-        </w:rPr>
-      </w:pPr>
-      <w:r>
-        <w:rPr>
-          <w:sz w:val="24"/>
-          <w:szCs w:val="24"/>
-          <w:lang w:val="uk-UA"/>
-        </w:rPr>
-        <w:t xml:space="preserve">This technical specification defines the implementation of Universal Links (iOS) and App Links (Android). </w:t>
-      </w:r>
-      <w:r>
-        <w:rPr>
-          <w:sz w:val="24"/>
-          <w:szCs w:val="24"/>
-        </w:rPr>
-        <w:t>T</w:t>
-      </w:r>
-      <w:r>
-        <w:rPr>
-          <w:sz w:val="24"/>
-          <w:szCs w:val="24"/>
-          <w:lang w:val="uk-UA"/>
-        </w:rPr>
-        <w:t>hese</w:t>
-      </w:r>
-      <w:r>
-        <w:rPr>
-          <w:sz w:val="24"/>
-          <w:szCs w:val="24"/>
-        </w:rPr>
-        <w:t xml:space="preserve"> </w:t>
-      </w:r>
-      <w:r>
-        <w:rPr>
-          <w:sz w:val="24"/>
-          <w:szCs w:val="24"/>
-          <w:lang w:val="uk-UA"/>
-        </w:rPr>
-        <w:t>are OS-level standards that use verified domain ownership to route users directly to the native application without leaving the current context.</w:t>
-      </w:r>
-    </w:p>
-    <w:p>
-      <w:pPr>
-        <w:rPr>
-          <w:sz w:val="24"/>
-          <w:szCs w:val="24"/>
-          <w:lang w:val="uk-UA"/>
-        </w:rPr>
-      </w:pPr>
-      <w:r>
-        <w:rPr>
-          <w:b/>
-          <w:bCs/>
-          <w:sz w:val="24"/>
-          <w:szCs w:val="24"/>
-          <w:lang w:val="uk-UA"/>
-        </w:rPr>
-        <w:t>1. Overview</w:t>
-      </w:r>
-      <w:r>
-        <w:rPr>
-          <w:sz w:val="24"/>
-          <w:szCs w:val="24"/>
-          <w:lang w:val="uk-UA"/>
-        </w:rPr>
-        <w:t> Universal Links (iOS) and App Links (Android) allow a standard HTTPS URL (e.g., https://yourgame.com/join?</w:t>
-      </w:r>
-      <w:proofErr w:type="spellStart"/>
-      <w:r>
-        <w:rPr>
-          <w:b/>
-          <w:bCs/>
-          <w:sz w:val="24"/>
-          <w:szCs w:val="24"/>
-        </w:rPr>
-        <w:t>roomId</w:t>
-      </w:r>
-      <w:proofErr w:type="spellEnd"/>
-      <w:r>
-        <w:rPr>
-          <w:sz w:val="24"/>
-          <w:szCs w:val="24"/>
-          <w:lang w:val="uk-UA"/>
-        </w:rPr>
-        <w:t>=123) to act as a direct entry point to a native app. If the app is installed, the OS intercepts the URL and launches the app. If the app is missing, the OS falls back to the mobile browser, where the Deferred Deep Linking logic begins.</w:t>
-      </w:r>
-    </w:p>
-    <w:p>
-      <w:pPr>
-        <w:rPr>
-          <w:sz w:val="24"/>
-          <w:szCs w:val="24"/>
-          <w:lang w:val="uk-UA"/>
-        </w:rPr>
-      </w:pPr>
-      <w:r>
-        <w:rPr>
-          <w:b/>
-          <w:bCs/>
-          <w:sz w:val="24"/>
-          <w:szCs w:val="24"/>
-          <w:lang w:val="uk-UA"/>
-        </w:rPr>
-        <w:t>2. Domain Verification (The "Handshake")</w:t>
-      </w:r>
-      <w:r>
-        <w:rPr>
-          <w:sz w:val="24"/>
-          <w:szCs w:val="24"/>
-          <w:lang w:val="uk-UA"/>
-        </w:rPr>
-        <w:t> For security, the OS must verify that the app developer owns the domain. This requires hosting specific JSON manifests in the /.well-known/ directory of your HTTPS server.</w:t>
-      </w:r>
-    </w:p>
-    <w:p>
-      <w:pPr>
-        <w:numPr>
-          <w:ilvl w:val="0"/>
-          <w:numId w:val="41"/>
-        </w:numPr>
-        <w:rPr>
-          <w:sz w:val="24"/>
-          <w:szCs w:val="24"/>
-          <w:lang w:val="uk-UA"/>
-        </w:rPr>
-      </w:pPr>
-      <w:r>
-        <w:rPr>
-          <w:b/>
-          <w:bCs/>
-          <w:sz w:val="24"/>
-          <w:szCs w:val="24"/>
-          <w:lang w:val="uk-UA"/>
-        </w:rPr>
-        <w:t>A. iOS: </w:t>
-      </w:r>
-      <w:r>
-        <w:rPr>
-          <w:b/>
-          <w:bCs/>
-          <w:i/>
-          <w:iCs/>
-          <w:sz w:val="24"/>
-          <w:szCs w:val="24"/>
-          <w:lang w:val="uk-UA"/>
-        </w:rPr>
-        <w:t>apple-app-site-association</w:t>
-      </w:r>
-      <w:r>
-        <w:rPr>
-          <w:b/>
-          <w:bCs/>
-          <w:sz w:val="24"/>
-          <w:szCs w:val="24"/>
-          <w:lang w:val="uk-UA"/>
-        </w:rPr>
-        <w:t> (AASA)</w:t>
-      </w:r>
-    </w:p>
-    <w:p>
-      <w:pPr>
-        <w:numPr>
-          <w:ilvl w:val="1"/>
-          <w:numId w:val="41"/>
-        </w:numPr>
-        <w:rPr>
-          <w:sz w:val="24"/>
-          <w:szCs w:val="24"/>
-          <w:lang w:val="uk-UA"/>
-        </w:rPr>
-      </w:pPr>
-      <w:r>
-        <w:rPr>
-          <w:sz w:val="24"/>
-          <w:szCs w:val="24"/>
-          <w:lang w:val="uk-UA"/>
-        </w:rPr>
-        <w:t>File Name: </w:t>
-      </w:r>
-      <w:r>
-        <w:rPr>
-          <w:i/>
-          <w:iCs/>
-          <w:sz w:val="24"/>
-          <w:szCs w:val="24"/>
-          <w:lang w:val="uk-UA"/>
-        </w:rPr>
-        <w:t>apple-app-site-association</w:t>
-      </w:r>
-      <w:r>
-        <w:rPr>
-          <w:sz w:val="24"/>
-          <w:szCs w:val="24"/>
-          <w:lang w:val="uk-UA"/>
-        </w:rPr>
-        <w:t> (No extension).</w:t>
-      </w:r>
-    </w:p>
-    <w:p>
-      <w:pPr>
-        <w:numPr>
-          <w:ilvl w:val="1"/>
-          <w:numId w:val="41"/>
-        </w:numPr>
-        <w:rPr>
-          <w:sz w:val="24"/>
-          <w:szCs w:val="24"/>
-          <w:lang w:val="uk-UA"/>
-        </w:rPr>
-      </w:pPr>
-      <w:r>
-        <w:rPr>
-          <w:sz w:val="24"/>
-          <w:szCs w:val="24"/>
-          <w:lang w:val="uk-UA"/>
-        </w:rPr>
-        <w:t>MIME Type: application/json.</w:t>
-      </w:r>
-    </w:p>
-    <w:p>
-      <w:pPr>
-        <w:numPr>
-          <w:ilvl w:val="1"/>
-          <w:numId w:val="41"/>
-        </w:numPr>
-        <w:rPr>
-          <w:sz w:val="24"/>
-          <w:szCs w:val="24"/>
-          <w:lang w:val="uk-UA"/>
-        </w:rPr>
-      </w:pPr>
-      <w:r>
-        <w:rPr>
-          <w:sz w:val="24"/>
-          <w:szCs w:val="24"/>
-          <w:lang w:val="uk-UA"/>
-        </w:rPr>
-        <w:t>Key Requirement: Must contain the appID (TeamID.BundleID) and the paths the app is authorized to handle.</w:t>
-      </w:r>
-    </w:p>
-    <w:p>
-      <w:pPr>
-        <w:numPr>
-          <w:ilvl w:val="0"/>
-          <w:numId w:val="41"/>
-        </w:numPr>
-        <w:rPr>
-          <w:sz w:val="24"/>
-          <w:szCs w:val="24"/>
-          <w:lang w:val="uk-UA"/>
-        </w:rPr>
-      </w:pPr>
-      <w:r>
-        <w:rPr>
-          <w:b/>
-          <w:bCs/>
-          <w:sz w:val="24"/>
-          <w:szCs w:val="24"/>
-          <w:lang w:val="uk-UA"/>
-        </w:rPr>
-        <w:t>B. Android: assetlinks.json</w:t>
-      </w:r>
-    </w:p>
-    <w:p>
-      <w:pPr>
-        <w:numPr>
-          <w:ilvl w:val="1"/>
-          <w:numId w:val="41"/>
-        </w:numPr>
-        <w:rPr>
-          <w:sz w:val="24"/>
-          <w:szCs w:val="24"/>
-          <w:lang w:val="uk-UA"/>
-        </w:rPr>
-      </w:pPr>
-      <w:r>
-        <w:rPr>
-          <w:sz w:val="24"/>
-          <w:szCs w:val="24"/>
-          <w:lang w:val="uk-UA"/>
-        </w:rPr>
-        <w:t>File Name: </w:t>
-      </w:r>
-      <w:r>
-        <w:rPr>
-          <w:i/>
-          <w:iCs/>
-          <w:sz w:val="24"/>
-          <w:szCs w:val="24"/>
-          <w:lang w:val="uk-UA"/>
-        </w:rPr>
-        <w:t>assetlinks.json</w:t>
-      </w:r>
-      <w:r>
-        <w:rPr>
-          <w:sz w:val="24"/>
-          <w:szCs w:val="24"/>
-          <w:lang w:val="uk-UA"/>
-        </w:rPr>
-        <w:t>.</w:t>
-      </w:r>
-    </w:p>
-    <w:p>
-      <w:pPr>
-        <w:numPr>
-          <w:ilvl w:val="1"/>
-          <w:numId w:val="41"/>
-        </w:numPr>
-        <w:rPr>
-          <w:sz w:val="24"/>
-          <w:szCs w:val="24"/>
-          <w:lang w:val="uk-UA"/>
-        </w:rPr>
-      </w:pPr>
-      <w:r>
-        <w:rPr>
-          <w:sz w:val="24"/>
-          <w:szCs w:val="24"/>
-          <w:lang w:val="uk-UA"/>
-        </w:rPr>
-        <w:t>MIME Type: application/json.</w:t>
-      </w:r>
-    </w:p>
-    <w:p>
-      <w:pPr>
-        <w:numPr>
-          <w:ilvl w:val="1"/>
-          <w:numId w:val="41"/>
-        </w:numPr>
-        <w:rPr>
-          <w:sz w:val="24"/>
-          <w:szCs w:val="24"/>
-          <w:lang w:val="uk-UA"/>
-        </w:rPr>
-      </w:pPr>
-      <w:r>
-        <w:rPr>
-          <w:sz w:val="24"/>
-          <w:szCs w:val="24"/>
-          <w:lang w:val="uk-UA"/>
-        </w:rPr>
-        <w:t>Key Requirement: Must contain the package_name and the sha256_cert_fingerprints of your app’s signing certificate.</w:t>
-      </w:r>
-    </w:p>
-    <w:p>
-      <w:pPr>
-        <w:rPr>
-          <w:sz w:val="24"/>
-          <w:szCs w:val="24"/>
-          <w:lang w:val="uk-UA"/>
-        </w:rPr>
-      </w:pPr>
-      <w:r>
-        <w:rPr>
-          <w:b/>
-          <w:bCs/>
-          <w:sz w:val="24"/>
-          <w:szCs w:val="24"/>
-          <w:lang w:val="uk-UA"/>
-        </w:rPr>
-        <w:t>3. Technical Execution Flow</w:t>
-      </w:r>
-    </w:p>
-    <w:p>
-      <w:pPr>
-        <w:numPr>
-          <w:ilvl w:val="0"/>
-          <w:numId w:val="42"/>
-        </w:numPr>
-        <w:rPr>
-          <w:sz w:val="24"/>
-          <w:szCs w:val="24"/>
-          <w:lang w:val="uk-UA"/>
-        </w:rPr>
-      </w:pPr>
-      <w:r>
-        <w:rPr>
-          <w:b/>
-          <w:bCs/>
-          <w:sz w:val="24"/>
-          <w:szCs w:val="24"/>
-          <w:lang w:val="uk-UA"/>
-        </w:rPr>
-        <w:t>System Interception:</w:t>
-      </w:r>
-      <w:r>
-        <w:rPr>
-          <w:sz w:val="24"/>
-          <w:szCs w:val="24"/>
-          <w:lang w:val="uk-UA"/>
-        </w:rPr>
-        <w:t> The user scans a QR code containing an HTTPS URL. The OS checks its internal database for verified domain associations.</w:t>
-      </w:r>
-    </w:p>
-    <w:p>
-      <w:pPr>
-        <w:numPr>
-          <w:ilvl w:val="0"/>
-          <w:numId w:val="42"/>
-        </w:numPr>
-        <w:rPr>
-          <w:sz w:val="24"/>
-          <w:szCs w:val="24"/>
-          <w:lang w:val="uk-UA"/>
-        </w:rPr>
-      </w:pPr>
-      <w:r>
-        <w:rPr>
-          <w:b/>
-          <w:bCs/>
-          <w:sz w:val="24"/>
-          <w:szCs w:val="24"/>
-          <w:lang w:val="uk-UA"/>
-        </w:rPr>
-        <w:t>App Installed Path:</w:t>
-      </w:r>
-    </w:p>
-    <w:p>
-      <w:pPr>
-        <w:numPr>
-          <w:ilvl w:val="1"/>
-          <w:numId w:val="42"/>
-        </w:numPr>
-        <w:rPr>
-          <w:sz w:val="24"/>
-          <w:szCs w:val="24"/>
-          <w:lang w:val="uk-UA"/>
-        </w:rPr>
-      </w:pPr>
-      <w:r>
-        <w:rPr>
-          <w:sz w:val="24"/>
-          <w:szCs w:val="24"/>
-          <w:lang w:val="uk-UA"/>
-        </w:rPr>
-        <w:t>The OS launches the app immediately.</w:t>
-      </w:r>
-    </w:p>
-    <w:p>
-      <w:pPr>
-        <w:numPr>
-          <w:ilvl w:val="1"/>
-          <w:numId w:val="42"/>
-        </w:numPr>
-        <w:rPr>
-          <w:sz w:val="24"/>
-          <w:szCs w:val="24"/>
-          <w:lang w:val="uk-UA"/>
-        </w:rPr>
-      </w:pPr>
-      <w:r>
-        <w:rPr>
-          <w:sz w:val="24"/>
-          <w:szCs w:val="24"/>
-          <w:lang w:val="uk-UA"/>
-        </w:rPr>
-        <w:t>The app receives the URL via userActivity (iOS) or Intent (Android).</w:t>
-      </w:r>
-    </w:p>
-    <w:p>
-      <w:pPr>
-        <w:numPr>
-          <w:ilvl w:val="1"/>
-          <w:numId w:val="42"/>
-        </w:numPr>
-        <w:rPr>
-          <w:sz w:val="24"/>
-          <w:szCs w:val="24"/>
-          <w:lang w:val="uk-UA"/>
-        </w:rPr>
-      </w:pPr>
-      <w:r>
-        <w:rPr>
-          <w:sz w:val="24"/>
-          <w:szCs w:val="24"/>
-          <w:lang w:val="uk-UA"/>
-        </w:rPr>
-        <w:t>The app parses </w:t>
-      </w:r>
-      <w:proofErr w:type="spellStart"/>
-      <w:r>
-        <w:rPr>
-          <w:b/>
-          <w:bCs/>
-          <w:i/>
-          <w:iCs/>
-          <w:sz w:val="24"/>
-          <w:szCs w:val="24"/>
-        </w:rPr>
-        <w:t>roomId</w:t>
-      </w:r>
-      <w:proofErr w:type="spellEnd"/>
-      <w:r>
-        <w:rPr>
-          <w:sz w:val="24"/>
-          <w:szCs w:val="24"/>
-          <w:lang w:val="uk-UA"/>
-        </w:rPr>
-        <w:t xml:space="preserve"> </w:t>
-      </w:r>
-      <w:r>
-        <w:rPr>
-          <w:sz w:val="24"/>
-          <w:szCs w:val="24"/>
-          <w:lang w:val="uk-UA"/>
-        </w:rPr>
-        <w:t>=123 and connects to the game.</w:t>
-      </w:r>
-    </w:p>
-    <w:p>
-      <w:pPr>
-        <w:numPr>
-          <w:ilvl w:val="0"/>
-          <w:numId w:val="42"/>
-        </w:numPr>
-        <w:rPr>
-          <w:sz w:val="24"/>
-          <w:szCs w:val="24"/>
-          <w:lang w:val="uk-UA"/>
-        </w:rPr>
-      </w:pPr>
-      <w:r>
-        <w:rPr>
-          <w:b/>
-          <w:bCs/>
-          <w:sz w:val="24"/>
-          <w:szCs w:val="24"/>
-          <w:lang w:val="uk-UA"/>
-        </w:rPr>
-        <w:t>App Missing Path (Fallback to Deferred):</w:t>
-      </w:r>
-    </w:p>
-    <w:p>
-      <w:pPr>
-        <w:numPr>
-          <w:ilvl w:val="1"/>
-          <w:numId w:val="42"/>
-        </w:numPr>
-        <w:rPr>
-          <w:sz w:val="24"/>
-          <w:szCs w:val="24"/>
-          <w:lang w:val="uk-UA"/>
-        </w:rPr>
-      </w:pPr>
-      <w:r>
-        <w:rPr>
-          <w:sz w:val="24"/>
-          <w:szCs w:val="24"/>
-          <w:lang w:val="uk-UA"/>
-        </w:rPr>
-        <w:t>The OS opens the URL in the mobile browser.</w:t>
-      </w:r>
-    </w:p>
-    <w:p>
-      <w:pPr>
-        <w:numPr>
-          <w:ilvl w:val="1"/>
-          <w:numId w:val="42"/>
-        </w:numPr>
-        <w:rPr>
-          <w:sz w:val="24"/>
-          <w:szCs w:val="24"/>
-          <w:lang w:val="uk-UA"/>
-        </w:rPr>
-      </w:pPr>
-      <w:r>
-        <w:rPr>
-          <w:sz w:val="24"/>
-          <w:szCs w:val="24"/>
-          <w:lang w:val="uk-UA"/>
-        </w:rPr>
-        <w:lastRenderedPageBreak/>
-        <w:t>The Redirector page loads and captures Fingerprint FP1.</w:t>
-      </w:r>
-    </w:p>
-    <w:p>
-      <w:pPr>
-        <w:numPr>
-          <w:ilvl w:val="1"/>
-          <w:numId w:val="42"/>
-        </w:numPr>
-        <w:rPr>
-          <w:sz w:val="24"/>
-          <w:szCs w:val="24"/>
-          <w:lang w:val="uk-UA"/>
-        </w:rPr>
-      </w:pPr>
-      <w:r>
-        <w:rPr>
-          <w:sz w:val="24"/>
-          <w:szCs w:val="24"/>
-          <w:lang w:val="uk-UA"/>
-        </w:rPr>
-        <w:t>The server saves the context with a 30-minute TTL.</w:t>
-      </w:r>
-    </w:p>
-    <w:p>
-      <w:pPr>
-        <w:numPr>
-          <w:ilvl w:val="1"/>
-          <w:numId w:val="42"/>
-        </w:numPr>
-        <w:rPr>
-          <w:sz w:val="24"/>
-          <w:szCs w:val="24"/>
-          <w:lang w:val="uk-UA"/>
-        </w:rPr>
-      </w:pPr>
-      <w:r>
-        <w:rPr>
-          <w:sz w:val="24"/>
-          <w:szCs w:val="24"/>
-          <w:lang w:val="uk-UA"/>
-        </w:rPr>
-        <w:t>The user is redirected to the App Store.</w:t>
-      </w:r>
-    </w:p>
-    <w:p>
-      <w:pPr>
-        <w:numPr>
-          <w:ilvl w:val="1"/>
-          <w:numId w:val="42"/>
-        </w:numPr>
-        <w:rPr>
-          <w:sz w:val="24"/>
-          <w:szCs w:val="24"/>
-          <w:lang w:val="uk-UA"/>
-        </w:rPr>
-      </w:pPr>
-      <w:r>
-        <w:rPr>
-          <w:sz w:val="24"/>
-          <w:szCs w:val="24"/>
-          <w:lang w:val="uk-UA"/>
-        </w:rPr>
-        <w:t>Upon first launch, the app uses Fingerprint FP2 to retrieve the lost roomID from the server.</w:t>
-      </w:r>
-    </w:p>
-    <w:p>
-      <w:pPr>
-        <w:rPr>
-          <w:sz w:val="24"/>
-          <w:szCs w:val="24"/>
-          <w:lang w:val="uk-UA"/>
-        </w:rPr>
-      </w:pPr>
-      <w:r>
-        <w:rPr>
-          <w:b/>
-          <w:bCs/>
-          <w:sz w:val="24"/>
-          <w:szCs w:val="24"/>
-          <w:lang w:val="uk-UA"/>
-        </w:rPr>
-        <w:t>4. Implementation Notes</w:t>
-      </w:r>
-    </w:p>
-    <w:p>
-      <w:pPr>
-        <w:numPr>
-          <w:ilvl w:val="0"/>
-          <w:numId w:val="43"/>
-        </w:numPr>
-        <w:rPr>
-          <w:sz w:val="24"/>
-          <w:szCs w:val="24"/>
-          <w:lang w:val="uk-UA"/>
-        </w:rPr>
-      </w:pPr>
-      <w:r>
-        <w:rPr>
-          <w:b/>
-          <w:bCs/>
-          <w:sz w:val="24"/>
-          <w:szCs w:val="24"/>
-          <w:lang w:val="uk-UA"/>
-        </w:rPr>
-        <w:t>Verification Latency:</w:t>
-      </w:r>
-      <w:r>
-        <w:rPr>
-          <w:sz w:val="24"/>
-          <w:szCs w:val="24"/>
-          <w:lang w:val="uk-UA"/>
-        </w:rPr>
-        <w:t> Apple's CDN caches AASA files. Changes may take up to 24 hours to propagate across all devices.</w:t>
-      </w:r>
-    </w:p>
-    <w:p>
-      <w:pPr>
-        <w:numPr>
-          <w:ilvl w:val="0"/>
-          <w:numId w:val="43"/>
-        </w:numPr>
-        <w:rPr>
-          <w:sz w:val="24"/>
-          <w:szCs w:val="24"/>
-          <w:lang w:val="uk-UA"/>
-        </w:rPr>
-      </w:pPr>
-      <w:r>
-        <w:rPr>
-          <w:b/>
-          <w:bCs/>
-          <w:sz w:val="24"/>
-          <w:szCs w:val="24"/>
-          <w:lang w:val="uk-UA"/>
-        </w:rPr>
-        <w:t>HTTPS Only:</w:t>
-      </w:r>
-      <w:r>
-        <w:rPr>
-          <w:sz w:val="24"/>
-          <w:szCs w:val="24"/>
-          <w:lang w:val="uk-UA"/>
-        </w:rPr>
-        <w:t> Both iOS and Android strictly require a valid SSL certificate for domain verification.</w:t>
-      </w:r>
-    </w:p>
-    <w:p>
-      <w:pPr>
-        <w:numPr>
-          <w:ilvl w:val="0"/>
-          <w:numId w:val="43"/>
-        </w:numPr>
-        <w:rPr>
-          <w:sz w:val="24"/>
-          <w:szCs w:val="24"/>
-          <w:lang w:val="uk-UA"/>
-        </w:rPr>
-      </w:pPr>
-      <w:r>
-        <w:rPr>
-          <w:b/>
-          <w:bCs/>
-          <w:sz w:val="24"/>
-          <w:szCs w:val="24"/>
-          <w:lang w:val="uk-UA"/>
-        </w:rPr>
-        <w:t>Partial Failure:</w:t>
-      </w:r>
-      <w:r>
-        <w:rPr>
-          <w:sz w:val="24"/>
-          <w:szCs w:val="24"/>
-          <w:lang w:val="uk-UA"/>
-        </w:rPr>
-        <w:t> If verification fails for any reason, the OS will default to the browser, making your Deferred Deep Linking infrastructure a mandatory backup.</w:t>
-      </w:r>
-    </w:p>
-    <w:p>
-      <w:pPr>
-        <w:ind w:left="360"/>
-        <w:rPr>
-          <w:sz w:val="24"/>
-          <w:szCs w:val="24"/>
-        </w:rPr>
-      </w:pPr>
-      <w:r>
-        <w:rPr>
-          <w:b/>
-          <w:bCs/>
-          <w:sz w:val="24"/>
-          <w:szCs w:val="24"/>
-        </w:rPr>
-        <w:t>Flow diagram of the method.</w:t>
-      </w:r>
-    </w:p>
-    <w:p>
-      <w:r>
-        <w:rPr>
-          <w:i/>
-          <w:iCs/>
-          <w:noProof/>
-        </w:rPr>
-        <w:drawing>
-          <wp:inline distT="0" distB="0" distL="0" distR="0" wp14:anchorId="08BC2AAD" wp14:editId="1934A70A">
-            <wp:extent cx="5943600" cy="4356509"/>
-            <wp:effectExtent l="0" t="0" r="0" b="6350"/>
-            <wp:docPr id="1809183539" name="Picture 1"/>
-            <wp:cNvGraphicFramePr>
-              <a:graphicFrameLocks xmlns:a="http://schemas.openxmlformats.org/drawingml/2006/main" noChangeAspect="1"/>
-            </wp:cNvGraphicFramePr>
-            <a:graphic xmlns:a="http://schemas.openxmlformats.org/drawingml/2006/main">
-              <a:graphicData uri="http://schemas.openxmlformats.org/drawingml/2006/picture">
-                <pic:pic xmlns:pic="http://schemas.openxmlformats.org/drawingml/2006/picture">
-                  <pic:nvPicPr>
-                    <pic:cNvPr id="0" name="Picture 1"/>
-                    <pic:cNvPicPr>
-                      <a:picLocks noChangeAspect="1" noChangeArrowheads="1"/>
-                    </pic:cNvPicPr>
-                  </pic:nvPicPr>
-                  <pic:blipFill>
-                    <a:blip r:embed="rId12" cstate="print">
-                      <a:extLst>
-                        <a:ext uri="{28A0092B-C50C-407E-A947-70E740481C1C}">
-                          <a14:useLocalDpi xmlns:a14="http://schemas.microsoft.com/office/drawing/2010/main" val="0"/>
-                        </a:ext>
-                      </a:extLst>
-                    </a:blip>
-                    <a:srcRect/>
-                    <a:stretch>
-                      <a:fillRect/>
-                    </a:stretch>
-                  </pic:blipFill>
-                  <pic:spPr bwMode="auto">
-                    <a:xfrm>
-                      <a:off x="0" y="0"/>
-                      <a:ext cx="5943600" cy="4356509"/>
-                    </a:xfrm>
-                    <a:prstGeom prst="rect">
-                      <a:avLst/>
-                    </a:prstGeom>
-                    <a:noFill/>
-                    <a:ln>
-                      <a:noFill/>
-                    </a:ln>
-                  </pic:spPr>
-                </pic:pic>
-              </a:graphicData>
-            </a:graphic>
-          </wp:inline>
-        </w:drawing>
-      </w:r>
-    </w:p>
-    <w:p>
-      <w:pPr>
-        <w:rPr>
-          <w:b/>
-          <w:bCs/>
-        </w:rPr>
-      </w:pPr>
-    </w:p>
-    <w:p>
-      <w:pPr>
-        <w:rPr>
-          <w:sz w:val="24"/>
-          <w:szCs w:val="24"/>
-          <w:lang w:val="uk-UA"/>
-        </w:rPr>
-      </w:pPr>
-      <w:r>
-        <w:rPr>
-          <w:b/>
-          <w:bCs/>
-          <w:sz w:val="24"/>
-          <w:szCs w:val="24"/>
-          <w:lang w:val="uk-UA"/>
-        </w:rPr>
-        <w:lastRenderedPageBreak/>
-        <w:t>Pros vs. Cons (Universal/App Links):</w:t>
-      </w:r>
-    </w:p>
-    <w:tbl>
-      <w:tblPr>
-        <w:tblW w:w="0" w:type="auto"/>
-        <w:shd w:val="clear" w:color="auto" w:fill="FFFFFF"/>
-        <w:tblCellMar>
-          <w:top w:w="15" w:type="dxa"/>
-          <w:left w:w="15" w:type="dxa"/>
-          <w:bottom w:w="15" w:type="dxa"/>
-          <w:right w:w="15" w:type="dxa"/>
-        </w:tblCellMar>
-        <w:tblLook w:val="04A0" w:firstRow="1" w:lastRow="0" w:firstColumn="1" w:lastColumn="0" w:noHBand="0" w:noVBand="1"/>
-      </w:tblPr>
-      <w:tblGrid>
-        <w:gridCol w:w="4249"/>
-        <w:gridCol w:w="5095"/>
-      </w:tblGrid>
-      <w:tr>
-        <w:trPr>
-          <w:tblHeader/>
-        </w:trPr>
-        <w:tc>
-          <w:tcPr>
-            <w:tcW w:w="0" w:type="auto"/>
-            <w:tcBorders>
-              <w:top w:val="single" w:sz="6" w:space="0" w:color="D1D9E0"/>
-              <w:left w:val="single" w:sz="6" w:space="0" w:color="D1D9E0"/>
-              <w:bottom w:val="single" w:sz="6" w:space="0" w:color="D1D9E0"/>
-              <w:right w:val="single" w:sz="6" w:space="0" w:color="D1D9E0"/>
-            </w:tcBorders>
-            <w:shd w:val="clear" w:color="auto" w:fill="FFFFFF"/>
-            <w:tcMar>
-              <w:top w:w="90" w:type="dxa"/>
-              <w:left w:w="195" w:type="dxa"/>
-              <w:bottom w:w="90" w:type="dxa"/>
-              <w:right w:w="195" w:type="dxa"/>
-            </w:tcMar>
-            <w:vAlign w:val="center"/>
-            <w:hideMark/>
-          </w:tcPr>
-          <w:p>
-            <w:pPr>
-              <w:rPr>
-                <w:b/>
-                <w:bCs/>
-                <w:sz w:val="24"/>
-                <w:szCs w:val="24"/>
-                <w:lang w:val="uk-UA"/>
-              </w:rPr>
-            </w:pPr>
-            <w:r>
-              <w:rPr>
-                <w:b/>
-                <w:bCs/>
-                <w:sz w:val="24"/>
-                <w:szCs w:val="24"/>
-                <w:lang w:val="uk-UA"/>
-              </w:rPr>
-              <w:t>Pros</w:t>
-            </w:r>
-          </w:p>
-        </w:tc>
-        <w:tc>
-          <w:tcPr>
-            <w:tcW w:w="0" w:type="auto"/>
-            <w:tcBorders>
-              <w:top w:val="single" w:sz="6" w:space="0" w:color="D1D9E0"/>
-              <w:left w:val="single" w:sz="6" w:space="0" w:color="D1D9E0"/>
-              <w:bottom w:val="single" w:sz="6" w:space="0" w:color="D1D9E0"/>
-              <w:right w:val="single" w:sz="6" w:space="0" w:color="D1D9E0"/>
-            </w:tcBorders>
-            <w:shd w:val="clear" w:color="auto" w:fill="FFFFFF"/>
-            <w:tcMar>
-              <w:top w:w="90" w:type="dxa"/>
-              <w:left w:w="195" w:type="dxa"/>
-              <w:bottom w:w="90" w:type="dxa"/>
-              <w:right w:w="195" w:type="dxa"/>
-            </w:tcMar>
-            <w:vAlign w:val="center"/>
-            <w:hideMark/>
-          </w:tcPr>
-          <w:p>
-            <w:pPr>
-              <w:rPr>
-                <w:b/>
-                <w:bCs/>
-                <w:sz w:val="24"/>
-                <w:szCs w:val="24"/>
-                <w:lang w:val="uk-UA"/>
-              </w:rPr>
-            </w:pPr>
-            <w:r>
-              <w:rPr>
-                <w:b/>
-                <w:bCs/>
-                <w:sz w:val="24"/>
-                <w:szCs w:val="24"/>
-                <w:lang w:val="uk-UA"/>
-              </w:rPr>
-              <w:t>Cons</w:t>
-            </w:r>
-          </w:p>
-        </w:tc>
-      </w:tr>
-      <w:tr>
-        <w:tc>
-          <w:tcPr>
-            <w:tcW w:w="0" w:type="auto"/>
-            <w:tcBorders>
-              <w:top w:val="single" w:sz="6" w:space="0" w:color="D1D9E0"/>
-              <w:left w:val="single" w:sz="6" w:space="0" w:color="D1D9E0"/>
-              <w:bottom w:val="single" w:sz="6" w:space="0" w:color="D1D9E0"/>
-              <w:right w:val="single" w:sz="6" w:space="0" w:color="D1D9E0"/>
-            </w:tcBorders>
-            <w:shd w:val="clear" w:color="auto" w:fill="FFFFFF"/>
-            <w:tcMar>
-              <w:top w:w="90" w:type="dxa"/>
-              <w:left w:w="195" w:type="dxa"/>
-              <w:bottom w:w="90" w:type="dxa"/>
-              <w:right w:w="195" w:type="dxa"/>
-            </w:tcMar>
-            <w:vAlign w:val="center"/>
-            <w:hideMark/>
-          </w:tcPr>
-          <w:p>
-            <w:pPr>
-              <w:rPr>
-                <w:sz w:val="24"/>
-                <w:szCs w:val="24"/>
-                <w:lang w:val="uk-UA"/>
-              </w:rPr>
-            </w:pPr>
-            <w:r>
-              <w:rPr>
-                <w:b/>
-                <w:bCs/>
-                <w:sz w:val="24"/>
-                <w:szCs w:val="24"/>
-                <w:lang w:val="uk-UA"/>
-              </w:rPr>
-              <w:t>Seamless UX:</w:t>
-            </w:r>
-            <w:r>
-              <w:rPr>
-                <w:sz w:val="24"/>
-                <w:szCs w:val="24"/>
-                <w:lang w:val="uk-UA"/>
-              </w:rPr>
-              <w:t> Instant app launch without browser flashes or intermediate redirects.</w:t>
-            </w:r>
-          </w:p>
-        </w:tc>
-        <w:tc>
-          <w:tcPr>
-            <w:tcW w:w="0" w:type="auto"/>
-            <w:tcBorders>
-              <w:top w:val="single" w:sz="6" w:space="0" w:color="D1D9E0"/>
-              <w:left w:val="single" w:sz="6" w:space="0" w:color="D1D9E0"/>
-              <w:bottom w:val="single" w:sz="6" w:space="0" w:color="D1D9E0"/>
-              <w:right w:val="single" w:sz="6" w:space="0" w:color="D1D9E0"/>
-            </w:tcBorders>
-            <w:shd w:val="clear" w:color="auto" w:fill="FFFFFF"/>
-            <w:tcMar>
-              <w:top w:w="90" w:type="dxa"/>
-              <w:left w:w="195" w:type="dxa"/>
-              <w:bottom w:w="90" w:type="dxa"/>
-              <w:right w:w="195" w:type="dxa"/>
-            </w:tcMar>
-            <w:vAlign w:val="center"/>
-            <w:hideMark/>
-          </w:tcPr>
-          <w:p>
-            <w:pPr>
-              <w:rPr>
-                <w:sz w:val="24"/>
-                <w:szCs w:val="24"/>
-                <w:lang w:val="uk-UA"/>
-              </w:rPr>
-            </w:pPr>
-            <w:r>
-              <w:rPr>
-                <w:b/>
-                <w:bCs/>
-                <w:sz w:val="24"/>
-                <w:szCs w:val="24"/>
-                <w:lang w:val="uk-UA"/>
-              </w:rPr>
-              <w:t>High Complexity:</w:t>
-            </w:r>
-            <w:r>
-              <w:rPr>
-                <w:sz w:val="24"/>
-                <w:szCs w:val="24"/>
-                <w:lang w:val="uk-UA"/>
-              </w:rPr>
-              <w:t> Requires server-side SSL, specific hosting paths (/.well-known/), and exact manifest configurations.</w:t>
-            </w:r>
-          </w:p>
-        </w:tc>
-      </w:tr>
-      <w:tr>
-        <w:tc>
-          <w:tcPr>
-            <w:tcW w:w="0" w:type="auto"/>
-            <w:tcBorders>
-              <w:top w:val="single" w:sz="6" w:space="0" w:color="D1D9E0"/>
-              <w:left w:val="single" w:sz="6" w:space="0" w:color="D1D9E0"/>
-              <w:bottom w:val="single" w:sz="6" w:space="0" w:color="D1D9E0"/>
-              <w:right w:val="single" w:sz="6" w:space="0" w:color="D1D9E0"/>
-            </w:tcBorders>
-            <w:shd w:val="clear" w:color="auto" w:fill="F6F8FA"/>
-            <w:tcMar>
-              <w:top w:w="90" w:type="dxa"/>
-              <w:left w:w="195" w:type="dxa"/>
-              <w:bottom w:w="90" w:type="dxa"/>
-              <w:right w:w="195" w:type="dxa"/>
-            </w:tcMar>
-            <w:vAlign w:val="center"/>
-            <w:hideMark/>
-          </w:tcPr>
-          <w:p>
-            <w:pPr>
-              <w:rPr>
-                <w:sz w:val="24"/>
-                <w:szCs w:val="24"/>
-                <w:lang w:val="uk-UA"/>
-              </w:rPr>
-            </w:pPr>
-            <w:r>
-              <w:rPr>
-                <w:b/>
-                <w:bCs/>
-                <w:sz w:val="24"/>
-                <w:szCs w:val="24"/>
-                <w:lang w:val="uk-UA"/>
-              </w:rPr>
-              <w:t>Secure &amp; Anti-Hijacking:</w:t>
-            </w:r>
-            <w:r>
-              <w:rPr>
-                <w:sz w:val="24"/>
-                <w:szCs w:val="24"/>
-                <w:lang w:val="uk-UA"/>
-              </w:rPr>
-              <w:t> Verified domain ownership prevents other malicious apps from intercepting your links.</w:t>
-            </w:r>
-          </w:p>
-        </w:tc>
-        <w:tc>
-          <w:tcPr>
-            <w:tcW w:w="0" w:type="auto"/>
-            <w:tcBorders>
-              <w:top w:val="single" w:sz="6" w:space="0" w:color="D1D9E0"/>
-              <w:left w:val="single" w:sz="6" w:space="0" w:color="D1D9E0"/>
-              <w:bottom w:val="single" w:sz="6" w:space="0" w:color="D1D9E0"/>
-              <w:right w:val="single" w:sz="6" w:space="0" w:color="D1D9E0"/>
-            </w:tcBorders>
-            <w:shd w:val="clear" w:color="auto" w:fill="F6F8FA"/>
-            <w:tcMar>
-              <w:top w:w="90" w:type="dxa"/>
-              <w:left w:w="195" w:type="dxa"/>
-              <w:bottom w:w="90" w:type="dxa"/>
-              <w:right w:w="195" w:type="dxa"/>
-            </w:tcMar>
-            <w:vAlign w:val="center"/>
-            <w:hideMark/>
-          </w:tcPr>
-          <w:p>
-            <w:pPr>
-              <w:rPr>
-                <w:sz w:val="24"/>
-                <w:szCs w:val="24"/>
-                <w:lang w:val="uk-UA"/>
-              </w:rPr>
-            </w:pPr>
-            <w:r>
-              <w:rPr>
-                <w:b/>
-                <w:bCs/>
-                <w:sz w:val="24"/>
-                <w:szCs w:val="24"/>
-                <w:lang w:val="uk-UA"/>
-              </w:rPr>
-              <w:t>Verification Lag:</w:t>
-            </w:r>
-            <w:r>
-              <w:rPr>
-                <w:sz w:val="24"/>
-                <w:szCs w:val="24"/>
-                <w:lang w:val="uk-UA"/>
-              </w:rPr>
-              <w:t> Apple/Google CDNs can take 24–48h to cache new manifests, making rapid hotfixes difficult.</w:t>
-            </w:r>
-          </w:p>
-        </w:tc>
-      </w:tr>
-      <w:tr>
-        <w:tc>
-          <w:tcPr>
-            <w:tcW w:w="0" w:type="auto"/>
-            <w:tcBorders>
-              <w:top w:val="single" w:sz="6" w:space="0" w:color="D1D9E0"/>
-              <w:left w:val="single" w:sz="6" w:space="0" w:color="D1D9E0"/>
-              <w:bottom w:val="single" w:sz="6" w:space="0" w:color="D1D9E0"/>
-              <w:right w:val="single" w:sz="6" w:space="0" w:color="D1D9E0"/>
-            </w:tcBorders>
-            <w:shd w:val="clear" w:color="auto" w:fill="FFFFFF"/>
-            <w:tcMar>
-              <w:top w:w="90" w:type="dxa"/>
-              <w:left w:w="195" w:type="dxa"/>
-              <w:bottom w:w="90" w:type="dxa"/>
-              <w:right w:w="195" w:type="dxa"/>
-            </w:tcMar>
-            <w:vAlign w:val="center"/>
-            <w:hideMark/>
-          </w:tcPr>
-          <w:p>
-            <w:pPr>
-              <w:rPr>
-                <w:sz w:val="24"/>
-                <w:szCs w:val="24"/>
-                <w:lang w:val="uk-UA"/>
-              </w:rPr>
-            </w:pPr>
-            <w:r>
-              <w:rPr>
-                <w:b/>
-                <w:bCs/>
-                <w:sz w:val="24"/>
-                <w:szCs w:val="24"/>
-                <w:lang w:val="uk-UA"/>
-              </w:rPr>
-              <w:t>Privacy-First Compliance:</w:t>
-            </w:r>
-            <w:r>
-              <w:rPr>
-                <w:sz w:val="24"/>
-                <w:szCs w:val="24"/>
-                <w:lang w:val="uk-UA"/>
-              </w:rPr>
-              <w:t> Native routing bypasses the need for probabilistic fingerprinting, ensuring compliance with strict iOS 18+ and Android 16 privacy standards.</w:t>
-            </w:r>
-          </w:p>
-        </w:tc>
-        <w:tc>
-          <w:tcPr>
-            <w:tcW w:w="0" w:type="auto"/>
-            <w:tcBorders>
-              <w:top w:val="single" w:sz="6" w:space="0" w:color="D1D9E0"/>
-              <w:left w:val="single" w:sz="6" w:space="0" w:color="D1D9E0"/>
-              <w:bottom w:val="single" w:sz="6" w:space="0" w:color="D1D9E0"/>
-              <w:right w:val="single" w:sz="6" w:space="0" w:color="D1D9E0"/>
-            </w:tcBorders>
-            <w:shd w:val="clear" w:color="auto" w:fill="FFFFFF"/>
-            <w:tcMar>
-              <w:top w:w="90" w:type="dxa"/>
-              <w:left w:w="195" w:type="dxa"/>
-              <w:bottom w:w="90" w:type="dxa"/>
-              <w:right w:w="195" w:type="dxa"/>
-            </w:tcMar>
-            <w:vAlign w:val="center"/>
-            <w:hideMark/>
-          </w:tcPr>
-          <w:p>
-            <w:pPr>
-              <w:rPr>
-                <w:sz w:val="24"/>
-                <w:szCs w:val="24"/>
-                <w:lang w:val="uk-UA"/>
-              </w:rPr>
-            </w:pPr>
-            <w:r>
-              <w:rPr>
-                <w:b/>
-                <w:bCs/>
-                <w:sz w:val="24"/>
-                <w:szCs w:val="24"/>
-                <w:lang w:val="uk-UA"/>
-              </w:rPr>
-              <w:t>In-App Browser Sandboxing:</w:t>
-            </w:r>
-            <w:r>
-              <w:rPr>
-                <w:sz w:val="24"/>
-                <w:szCs w:val="24"/>
-                <w:lang w:val="uk-UA"/>
-              </w:rPr>
-              <w:t> Frequently fails if the QR is scanned using a social media app's camera (e.g., Instagram, TikTok, WeChat), trapping the user in a limited webview instead of launching the app.</w:t>
-            </w:r>
-          </w:p>
-        </w:tc>
-      </w:tr>
-      <w:tr>
-        <w:tc>
-          <w:tcPr>
-            <w:tcW w:w="0" w:type="auto"/>
-            <w:tcBorders>
-              <w:top w:val="single" w:sz="6" w:space="0" w:color="D1D9E0"/>
-              <w:left w:val="single" w:sz="6" w:space="0" w:color="D1D9E0"/>
-              <w:bottom w:val="single" w:sz="6" w:space="0" w:color="D1D9E0"/>
-              <w:right w:val="single" w:sz="6" w:space="0" w:color="D1D9E0"/>
-            </w:tcBorders>
-            <w:shd w:val="clear" w:color="auto" w:fill="F6F8FA"/>
-            <w:tcMar>
-              <w:top w:w="90" w:type="dxa"/>
-              <w:left w:w="195" w:type="dxa"/>
-              <w:bottom w:w="90" w:type="dxa"/>
-              <w:right w:w="195" w:type="dxa"/>
-            </w:tcMar>
-            <w:vAlign w:val="center"/>
-            <w:hideMark/>
-          </w:tcPr>
-          <w:p>
-            <w:pPr>
-              <w:rPr>
-                <w:sz w:val="24"/>
-                <w:szCs w:val="24"/>
-                <w:lang w:val="uk-UA"/>
-              </w:rPr>
-            </w:pPr>
-            <w:r>
-              <w:rPr>
-                <w:b/>
-                <w:bCs/>
-                <w:sz w:val="24"/>
-                <w:szCs w:val="24"/>
-                <w:lang w:val="uk-UA"/>
-              </w:rPr>
-              <w:t>Zero-Latency Routing:</w:t>
-            </w:r>
-            <w:r>
-              <w:rPr>
-                <w:sz w:val="24"/>
-                <w:szCs w:val="24"/>
-                <w:lang w:val="uk-UA"/>
-              </w:rPr>
-              <w:t> Modern OS optimizations make the handoff from the native Camera app to your application virtually instantaneous.</w:t>
-            </w:r>
-          </w:p>
-        </w:tc>
-        <w:tc>
-          <w:tcPr>
-            <w:tcW w:w="0" w:type="auto"/>
-            <w:tcBorders>
-              <w:top w:val="single" w:sz="6" w:space="0" w:color="D1D9E0"/>
-              <w:left w:val="single" w:sz="6" w:space="0" w:color="D1D9E0"/>
-              <w:bottom w:val="single" w:sz="6" w:space="0" w:color="D1D9E0"/>
-              <w:right w:val="single" w:sz="6" w:space="0" w:color="D1D9E0"/>
-            </w:tcBorders>
-            <w:shd w:val="clear" w:color="auto" w:fill="F6F8FA"/>
-            <w:tcMar>
-              <w:top w:w="90" w:type="dxa"/>
-              <w:left w:w="195" w:type="dxa"/>
-              <w:bottom w:w="90" w:type="dxa"/>
-              <w:right w:w="195" w:type="dxa"/>
-            </w:tcMar>
-            <w:vAlign w:val="center"/>
-            <w:hideMark/>
-          </w:tcPr>
-          <w:p>
-            <w:pPr>
-              <w:rPr>
-                <w:sz w:val="24"/>
-                <w:szCs w:val="24"/>
-                <w:lang w:val="uk-UA"/>
-              </w:rPr>
-            </w:pPr>
-            <w:r>
-              <w:rPr>
-                <w:b/>
-                <w:bCs/>
-                <w:sz w:val="24"/>
-                <w:szCs w:val="24"/>
-                <w:lang w:val="uk-UA"/>
-              </w:rPr>
-              <w:t>Local Testing Friction:</w:t>
-            </w:r>
-            <w:r>
-              <w:rPr>
-                <w:sz w:val="24"/>
-                <w:szCs w:val="24"/>
-                <w:lang w:val="uk-UA"/>
-              </w:rPr>
-              <w:t> Notoriously difficult to test during local development, requiring secure HTTP tunnels (like Ngrok/LocalTunnel) and valid SSL certificates just to debug.</w:t>
-            </w:r>
-          </w:p>
-        </w:tc>
-      </w:tr>
-      <w:tr>
-        <w:tc>
-          <w:tcPr>
-            <w:tcW w:w="0" w:type="auto"/>
-            <w:tcBorders>
-              <w:top w:val="single" w:sz="6" w:space="0" w:color="D1D9E0"/>
-              <w:left w:val="single" w:sz="6" w:space="0" w:color="D1D9E0"/>
-              <w:bottom w:val="single" w:sz="6" w:space="0" w:color="D1D9E0"/>
-              <w:right w:val="single" w:sz="6" w:space="0" w:color="D1D9E0"/>
-            </w:tcBorders>
-            <w:shd w:val="clear" w:color="auto" w:fill="FFFFFF"/>
-            <w:tcMar>
-              <w:top w:w="90" w:type="dxa"/>
-              <w:left w:w="195" w:type="dxa"/>
-              <w:bottom w:w="90" w:type="dxa"/>
-              <w:right w:w="195" w:type="dxa"/>
-            </w:tcMar>
-            <w:vAlign w:val="center"/>
-            <w:hideMark/>
-          </w:tcPr>
-          <w:p>
-            <w:pPr>
-              <w:rPr>
-                <w:sz w:val="24"/>
-                <w:szCs w:val="24"/>
-                <w:lang w:val="uk-UA"/>
-              </w:rPr>
-            </w:pPr>
-            <w:r>
-              <w:rPr>
-                <w:b/>
-                <w:bCs/>
-                <w:sz w:val="24"/>
-                <w:szCs w:val="24"/>
-                <w:lang w:val="uk-UA"/>
-              </w:rPr>
-              <w:t>Native Feel:</w:t>
-            </w:r>
-            <w:r>
-              <w:rPr>
-                <w:sz w:val="24"/>
-                <w:szCs w:val="24"/>
-                <w:lang w:val="uk-UA"/>
-              </w:rPr>
-              <w:t> Built-in OS support means it works natively directly from the default system camera without needing a specialized scanner app.</w:t>
-            </w:r>
-          </w:p>
-        </w:tc>
-        <w:tc>
-          <w:tcPr>
-            <w:tcW w:w="0" w:type="auto"/>
-            <w:tcBorders>
-              <w:top w:val="single" w:sz="6" w:space="0" w:color="D1D9E0"/>
-              <w:left w:val="single" w:sz="6" w:space="0" w:color="D1D9E0"/>
-              <w:bottom w:val="single" w:sz="6" w:space="0" w:color="D1D9E0"/>
-              <w:right w:val="single" w:sz="6" w:space="0" w:color="D1D9E0"/>
-            </w:tcBorders>
-            <w:shd w:val="clear" w:color="auto" w:fill="FFFFFF"/>
-            <w:tcMar>
-              <w:top w:w="90" w:type="dxa"/>
-              <w:left w:w="195" w:type="dxa"/>
-              <w:bottom w:w="90" w:type="dxa"/>
-              <w:right w:w="195" w:type="dxa"/>
-            </w:tcMar>
-            <w:vAlign w:val="center"/>
-            <w:hideMark/>
-          </w:tcPr>
-          <w:p>
-            <w:pPr>
-              <w:rPr>
-                <w:sz w:val="24"/>
-                <w:szCs w:val="24"/>
-                <w:lang w:val="uk-UA"/>
-              </w:rPr>
-            </w:pPr>
-            <w:r>
-              <w:rPr>
-                <w:b/>
-                <w:bCs/>
-                <w:sz w:val="24"/>
-                <w:szCs w:val="24"/>
-                <w:lang w:val="uk-UA"/>
-              </w:rPr>
-              <w:t>Fragile:</w:t>
-            </w:r>
-            <w:r>
-              <w:rPr>
-                <w:sz w:val="24"/>
-                <w:szCs w:val="24"/>
-                <w:lang w:val="uk-UA"/>
-              </w:rPr>
-              <w:t> If the JSON file is even slightly malformed or served with the wrong MIME type, the OS degrades to standard web links silently.</w:t>
-            </w:r>
-          </w:p>
-        </w:tc>
-      </w:tr>
-    </w:tbl>
-    <w:p>
-      <w:pPr>
-        <w:rPr>
-          <w:lang w:val="uk-UA"/>
-        </w:rPr>
-      </w:pPr>
-    </w:p>
-    <w:p/>
-    <w:p>
-      <w:pPr>
-        <w:pStyle w:val="Heading1"/>
-      </w:pPr>
-    </w:p>
-    <w:p/>
-    <w:p/>
-    <w:p/>
     <w:p>
       <w:pPr>
         <w:pStyle w:val="Heading1"/>
@@ -4475,25 +3692,7 @@
           <w:sz w:val="24"/>
           <w:szCs w:val="24"/>
         </w:rPr>
-        <w:t xml:space="preserve">    "</w:t>
-      </w:r>
-      <w:proofErr w:type="spellStart"/>
-      <w:r>
-        <w:rPr>
-          <w:rStyle w:val="FunctionTok"/>
-          <w:sz w:val="24"/>
-          <w:szCs w:val="24"/>
-        </w:rPr>
-        <w:t>screenId</w:t>
-      </w:r>
-      <w:proofErr w:type="spellEnd"/>
-      <w:r>
-        <w:rPr>
-          <w:rStyle w:val="FunctionTok"/>
-          <w:sz w:val="24"/>
-          <w:szCs w:val="24"/>
-        </w:rPr>
-        <w:t>": "CONTROL_SCREEN"</w:t>
+        <w:t xml:space="preserve">    "screenId": "CONTROL_SCREEN"</w:t>
       </w:r>
     </w:p>
     <w:p>
@@ -4700,25 +3899,25 @@
           <w:szCs w:val="24"/>
         </w:rPr>
         <w:lastRenderedPageBreak/>
-        <w:t xml:space="preserve">    "</w:t>
-      </w:r>
-      <w:proofErr w:type="spellStart"/>
-      <w:r>
+        <w:t xml:space="preserve">    "screenId": "CONTROL_SCREEN",</w:t>
+      </w:r>
+    </w:p>
+    <w:p>
+      <w:pPr>
+        <w:pStyle w:val="SourceCode"/>
         <w:rPr>
           <w:rStyle w:val="FunctionTok"/>
           <w:sz w:val="24"/>
           <w:szCs w:val="24"/>
         </w:rPr>
-        <w:t>screenId</w:t>
-      </w:r>
-      <w:proofErr w:type="spellEnd"/>
+      </w:pPr>
       <w:r>
         <w:rPr>
           <w:rStyle w:val="FunctionTok"/>
           <w:sz w:val="24"/>
           <w:szCs w:val="24"/>
         </w:rPr>
-        <w:t>": "CONTROL_SCREEN",</w:t>
+        <w:t xml:space="preserve">    "components": {</w:t>
       </w:r>
     </w:p>
     <w:p>
@@ -4736,7 +3935,7 @@
           <w:sz w:val="24"/>
           <w:szCs w:val="24"/>
         </w:rPr>
-        <w:t xml:space="preserve">    "components": {</w:t>
+        <w:t xml:space="preserve">      "player_name": { "content": "John" },</w:t>
       </w:r>
     </w:p>
     <w:p>
@@ -4754,81 +3953,7 @@
           <w:sz w:val="24"/>
           <w:szCs w:val="24"/>
         </w:rPr>
-        <w:t xml:space="preserve">      "</w:t>
-      </w:r>
-      <w:proofErr w:type="spellStart"/>
-      <w:proofErr w:type="gramStart"/>
-      <w:r>
-        <w:rPr>
-          <w:rStyle w:val="FunctionTok"/>
-          <w:sz w:val="24"/>
-          <w:szCs w:val="24"/>
-        </w:rPr>
-        <w:t>player</w:t>
-      </w:r>
-      <w:proofErr w:type="gramEnd"/>
-      <w:r>
-        <w:rPr>
-          <w:rStyle w:val="FunctionTok"/>
-          <w:sz w:val="24"/>
-          <w:szCs w:val="24"/>
-        </w:rPr>
-        <w:t>_name</w:t>
-      </w:r>
-      <w:proofErr w:type="spellEnd"/>
-      <w:r>
-        <w:rPr>
-          <w:rStyle w:val="FunctionTok"/>
-          <w:sz w:val="24"/>
-          <w:szCs w:val="24"/>
-        </w:rPr>
-        <w:t>": { "content": "John" },</w:t>
-      </w:r>
-    </w:p>
-    <w:p>
-      <w:pPr>
-        <w:pStyle w:val="SourceCode"/>
-        <w:rPr>
-          <w:rStyle w:val="FunctionTok"/>
-          <w:sz w:val="24"/>
-          <w:szCs w:val="24"/>
-        </w:rPr>
-      </w:pPr>
-      <w:r>
-        <w:rPr>
-          <w:rStyle w:val="FunctionTok"/>
-          <w:sz w:val="24"/>
-          <w:szCs w:val="24"/>
-        </w:rPr>
-        <w:t xml:space="preserve">      "</w:t>
-      </w:r>
-      <w:proofErr w:type="spellStart"/>
-      <w:proofErr w:type="gramStart"/>
-      <w:r>
-        <w:rPr>
-          <w:rStyle w:val="FunctionTok"/>
-          <w:sz w:val="24"/>
-          <w:szCs w:val="24"/>
-        </w:rPr>
-        <w:t>fire</w:t>
-      </w:r>
-      <w:proofErr w:type="gramEnd"/>
-      <w:r>
-        <w:rPr>
-          <w:rStyle w:val="FunctionTok"/>
-          <w:sz w:val="24"/>
-          <w:szCs w:val="24"/>
-        </w:rPr>
-        <w:t>_btn</w:t>
-      </w:r>
-      <w:proofErr w:type="spellEnd"/>
-      <w:r>
-        <w:rPr>
-          <w:rStyle w:val="FunctionTok"/>
-          <w:sz w:val="24"/>
-          <w:szCs w:val="24"/>
-        </w:rPr>
-        <w:t>": { "disabled": false }</w:t>
+        <w:t xml:space="preserve">      "fire_btn": { "disabled": false }</w:t>
       </w:r>
     </w:p>
     <w:p>
@@ -5064,35 +4189,43 @@
           <w:sz w:val="24"/>
           <w:szCs w:val="24"/>
         </w:rPr>
-        <w:t xml:space="preserve">      "</w:t>
-      </w:r>
-      <w:proofErr w:type="spellStart"/>
-      <w:proofErr w:type="gramStart"/>
-      <w:r>
+        <w:t xml:space="preserve">      "server_message": { </w:t>
+      </w:r>
+    </w:p>
+    <w:p>
+      <w:pPr>
+        <w:pStyle w:val="SourceCode"/>
         <w:rPr>
           <w:rStyle w:val="FunctionTok"/>
           <w:sz w:val="24"/>
           <w:szCs w:val="24"/>
         </w:rPr>
-        <w:t>server</w:t>
-      </w:r>
-      <w:proofErr w:type="gramEnd"/>
+      </w:pPr>
       <w:r>
         <w:rPr>
           <w:rStyle w:val="FunctionTok"/>
           <w:sz w:val="24"/>
           <w:szCs w:val="24"/>
         </w:rPr>
-        <w:t>_message</w:t>
-      </w:r>
-      <w:proofErr w:type="spellEnd"/>
-      <w:r>
+        <w:t xml:space="preserve">        "content": "Wrong code!", </w:t>
+      </w:r>
+    </w:p>
+    <w:p>
+      <w:pPr>
+        <w:pStyle w:val="SourceCode"/>
         <w:rPr>
           <w:rStyle w:val="FunctionTok"/>
           <w:sz w:val="24"/>
           <w:szCs w:val="24"/>
         </w:rPr>
-        <w:t xml:space="preserve">": { </w:t>
+      </w:pPr>
+      <w:r>
+        <w:rPr>
+          <w:rStyle w:val="FunctionTok"/>
+          <w:sz w:val="24"/>
+          <w:szCs w:val="24"/>
+        </w:rPr>
+        <w:t xml:space="preserve">        "style": { "color": "white", "fontSize": 60 }</w:t>
       </w:r>
     </w:p>
     <w:p>
@@ -5110,7 +4243,7 @@
           <w:sz w:val="24"/>
           <w:szCs w:val="24"/>
         </w:rPr>
-        <w:t xml:space="preserve">        "content": "Wrong code!", </w:t>
+        <w:t xml:space="preserve">      },</w:t>
       </w:r>
     </w:p>
     <w:p>
@@ -5128,25 +4261,25 @@
           <w:sz w:val="24"/>
           <w:szCs w:val="24"/>
         </w:rPr>
-        <w:t xml:space="preserve">        "style": { "color": "white", "</w:t>
-      </w:r>
-      <w:proofErr w:type="spellStart"/>
-      <w:r>
+        <w:t xml:space="preserve">      "submit_btn": { "disabled": true },</w:t>
+      </w:r>
+    </w:p>
+    <w:p>
+      <w:pPr>
+        <w:pStyle w:val="SourceCode"/>
         <w:rPr>
           <w:rStyle w:val="FunctionTok"/>
           <w:sz w:val="24"/>
           <w:szCs w:val="24"/>
         </w:rPr>
-        <w:t>fontSize</w:t>
-      </w:r>
-      <w:proofErr w:type="spellEnd"/>
+      </w:pPr>
       <w:r>
         <w:rPr>
           <w:rStyle w:val="FunctionTok"/>
           <w:sz w:val="24"/>
           <w:szCs w:val="24"/>
         </w:rPr>
-        <w:t>": 60 }</w:t>
+        <w:t xml:space="preserve">      "fire_btn": { "visible": true },</w:t>
       </w:r>
     </w:p>
     <w:p>
@@ -5164,145 +4297,7 @@
           <w:sz w:val="24"/>
           <w:szCs w:val="24"/>
         </w:rPr>
-        <w:t xml:space="preserve">      },</w:t>
-      </w:r>
-    </w:p>
-    <w:p>
-      <w:pPr>
-        <w:pStyle w:val="SourceCode"/>
-        <w:rPr>
-          <w:rStyle w:val="FunctionTok"/>
-          <w:sz w:val="24"/>
-          <w:szCs w:val="24"/>
-        </w:rPr>
-      </w:pPr>
-      <w:r>
-        <w:rPr>
-          <w:rStyle w:val="FunctionTok"/>
-          <w:sz w:val="24"/>
-          <w:szCs w:val="24"/>
-        </w:rPr>
-        <w:t xml:space="preserve">      "</w:t>
-      </w:r>
-      <w:proofErr w:type="spellStart"/>
-      <w:proofErr w:type="gramStart"/>
-      <w:r>
-        <w:rPr>
-          <w:rStyle w:val="FunctionTok"/>
-          <w:sz w:val="24"/>
-          <w:szCs w:val="24"/>
-        </w:rPr>
-        <w:t>submit</w:t>
-      </w:r>
-      <w:proofErr w:type="gramEnd"/>
-      <w:r>
-        <w:rPr>
-          <w:rStyle w:val="FunctionTok"/>
-          <w:sz w:val="24"/>
-          <w:szCs w:val="24"/>
-        </w:rPr>
-        <w:t>_btn</w:t>
-      </w:r>
-      <w:proofErr w:type="spellEnd"/>
-      <w:r>
-        <w:rPr>
-          <w:rStyle w:val="FunctionTok"/>
-          <w:sz w:val="24"/>
-          <w:szCs w:val="24"/>
-        </w:rPr>
-        <w:t>": { "disabled": true },</w:t>
-      </w:r>
-    </w:p>
-    <w:p>
-      <w:pPr>
-        <w:pStyle w:val="SourceCode"/>
-        <w:rPr>
-          <w:rStyle w:val="FunctionTok"/>
-          <w:sz w:val="24"/>
-          <w:szCs w:val="24"/>
-        </w:rPr>
-      </w:pPr>
-      <w:r>
-        <w:rPr>
-          <w:rStyle w:val="FunctionTok"/>
-          <w:sz w:val="24"/>
-          <w:szCs w:val="24"/>
-        </w:rPr>
-        <w:t xml:space="preserve">      "</w:t>
-      </w:r>
-      <w:proofErr w:type="spellStart"/>
-      <w:proofErr w:type="gramStart"/>
-      <w:r>
-        <w:rPr>
-          <w:rStyle w:val="FunctionTok"/>
-          <w:sz w:val="24"/>
-          <w:szCs w:val="24"/>
-        </w:rPr>
-        <w:t>fire</w:t>
-      </w:r>
-      <w:proofErr w:type="gramEnd"/>
-      <w:r>
-        <w:rPr>
-          <w:rStyle w:val="FunctionTok"/>
-          <w:sz w:val="24"/>
-          <w:szCs w:val="24"/>
-        </w:rPr>
-        <w:t>_btn</w:t>
-      </w:r>
-      <w:proofErr w:type="spellEnd"/>
-      <w:r>
-        <w:rPr>
-          <w:rStyle w:val="FunctionTok"/>
-          <w:sz w:val="24"/>
-          <w:szCs w:val="24"/>
-        </w:rPr>
-        <w:t>": { "visible": true },</w:t>
-      </w:r>
-    </w:p>
-    <w:p>
-      <w:pPr>
-        <w:pStyle w:val="SourceCode"/>
-        <w:rPr>
-          <w:rStyle w:val="FunctionTok"/>
-          <w:sz w:val="24"/>
-          <w:szCs w:val="24"/>
-        </w:rPr>
-      </w:pPr>
-      <w:r>
-        <w:rPr>
-          <w:rStyle w:val="FunctionTok"/>
-          <w:sz w:val="24"/>
-          <w:szCs w:val="24"/>
-        </w:rPr>
-        <w:t xml:space="preserve">      "</w:t>
-      </w:r>
-      <w:proofErr w:type="spellStart"/>
-      <w:proofErr w:type="gramStart"/>
-      <w:r>
-        <w:rPr>
-          <w:rStyle w:val="FunctionTok"/>
-          <w:sz w:val="24"/>
-          <w:szCs w:val="24"/>
-        </w:rPr>
-        <w:t>some</w:t>
-      </w:r>
-      <w:proofErr w:type="gramEnd"/>
-      <w:r>
-        <w:rPr>
-          <w:rStyle w:val="FunctionTok"/>
-          <w:sz w:val="24"/>
-          <w:szCs w:val="24"/>
-        </w:rPr>
-        <w:t>_img</w:t>
-      </w:r>
-      <w:proofErr w:type="spellEnd"/>
-      <w:r>
-        <w:rPr>
-          <w:rStyle w:val="FunctionTok"/>
-          <w:sz w:val="24"/>
-          <w:szCs w:val="24"/>
-        </w:rPr>
-        <w:t>": { "texture": "https://...", "visible": true }</w:t>
+        <w:t xml:space="preserve">      "some_img": { "texture": "https://...", "visible": true }</w:t>
       </w:r>
     </w:p>
     <w:p>
@@ -14332,7 +13327,7 @@
   <w:style w:type="paragraph" w:default="1" w:styleId="Normal">
     <w:name w:val="Normal"/>
     <w:qFormat/>
-    <w:rsid w:val="00AC3173"/>
+    <w:rsid w:val="00F91A36"/>
   </w:style>
   <w:style w:type="paragraph" w:styleId="Heading1">
     <w:name w:val="heading 1"/>
@@ -14533,6 +13528,7 @@
   <w:style w:type="character" w:default="1" w:styleId="DefaultParagraphFont">
     <w:name w:val="Default Paragraph Font"/>
     <w:uiPriority w:val="1"/>
+    <w:semiHidden/>
     <w:unhideWhenUsed/>
   </w:style>
   <w:style w:type="table" w:default="1" w:styleId="TableNormal">

</xml_diff>